<commit_message>
ansible - variables updated
</commit_message>
<xml_diff>
--- a/Ansible/7-variables.docx
+++ b/Ansible/7-variables.docx
@@ -1,6 +1,6 @@
 
 <file path=word/document.xml><?xml version="1.0" encoding="utf-8"?>
-<w:document xmlns:wpc="http://schemas.microsoft.com/office/word/2010/wordprocessingCanvas" xmlns:cx="http://schemas.microsoft.com/office/drawing/2014/chartex" xmlns:cx1="http://schemas.microsoft.com/office/drawing/2015/9/8/chartex" xmlns:cx2="http://schemas.microsoft.com/office/drawing/2015/10/21/chartex" xmlns:cx3="http://schemas.microsoft.com/office/drawing/2016/5/9/chartex" xmlns:cx4="http://schemas.microsoft.com/office/drawing/2016/5/10/chartex" xmlns:cx5="http://schemas.microsoft.com/office/drawing/2016/5/11/chartex" xmlns:cx6="http://schemas.microsoft.com/office/drawing/2016/5/12/chartex" xmlns:cx7="http://schemas.microsoft.com/office/drawing/2016/5/13/chartex" xmlns:cx8="http://schemas.microsoft.com/office/drawing/2016/5/14/chartex" xmlns:mc="http://schemas.openxmlformats.org/markup-compatibility/2006" xmlns:aink="http://schemas.microsoft.com/office/drawing/2016/ink" xmlns:am3d="http://schemas.microsoft.com/office/drawing/2017/model3d" xmlns:o="urn:schemas-microsoft-com:office:office" xmlns:oel="http://schemas.microsoft.com/office/2019/extlst" xmlns:r="http://schemas.openxmlformats.org/officeDocument/2006/relationships" xmlns:m="http://schemas.openxmlformats.org/officeDocument/2006/math" xmlns:v="urn:schemas-microsoft-com:vml" xmlns:wp14="http://schemas.microsoft.com/office/word/2010/wordprocessingDrawing" xmlns:wp="http://schemas.openxmlformats.org/drawingml/2006/wordprocessingDrawing" xmlns:w10="urn:schemas-microsoft-com:office:word" xmlns:w="http://schemas.openxmlformats.org/wordprocessingml/2006/main" xmlns:w14="http://schemas.microsoft.com/office/word/2010/wordml" xmlns:w15="http://schemas.microsoft.com/office/word/2012/wordml" xmlns:w16cex="http://schemas.microsoft.com/office/word/2018/wordml/cex" xmlns:w16cid="http://schemas.microsoft.com/office/word/2016/wordml/cid" xmlns:w16="http://schemas.microsoft.com/office/word/2018/wordml" xmlns:w16du="http://schemas.microsoft.com/office/word/2023/wordml/word16du" xmlns:w16sdtdh="http://schemas.microsoft.com/office/word/2020/wordml/sdtdatahash" xmlns:w16sdtfl="http://schemas.microsoft.com/office/word/2024/wordml/sdtformatlock" xmlns:w16se="http://schemas.microsoft.com/office/word/2015/wordml/symex" xmlns:wpg="http://schemas.microsoft.com/office/word/2010/wordprocessingGroup" xmlns:wpi="http://schemas.microsoft.com/office/word/2010/wordprocessingInk" xmlns:wne="http://schemas.microsoft.com/office/word/2006/wordml" xmlns:wps="http://schemas.microsoft.com/office/word/2010/wordprocessingShape" mc:Ignorable="w14 w15 w16se w16cid w16 w16cex w16sdtdh w16sdtfl w16du wp14">
+<w:document xmlns:wpc="http://schemas.microsoft.com/office/word/2010/wordprocessingCanvas" xmlns:cx="http://schemas.microsoft.com/office/drawing/2014/chartex" xmlns:cx1="http://schemas.microsoft.com/office/drawing/2015/9/8/chartex" xmlns:cx2="http://schemas.microsoft.com/office/drawing/2015/10/21/chartex" xmlns:cx3="http://schemas.microsoft.com/office/drawing/2016/5/9/chartex" xmlns:cx4="http://schemas.microsoft.com/office/drawing/2016/5/10/chartex" xmlns:cx5="http://schemas.microsoft.com/office/drawing/2016/5/11/chartex" xmlns:cx6="http://schemas.microsoft.com/office/drawing/2016/5/12/chartex" xmlns:cx7="http://schemas.microsoft.com/office/drawing/2016/5/13/chartex" xmlns:cx8="http://schemas.microsoft.com/office/drawing/2016/5/14/chartex" xmlns:mc="http://schemas.openxmlformats.org/markup-compatibility/2006" xmlns:aink="http://schemas.microsoft.com/office/drawing/2016/ink" xmlns:am3d="http://schemas.microsoft.com/office/drawing/2017/model3d" xmlns:o="urn:schemas-microsoft-com:office:office" xmlns:oel="http://schemas.microsoft.com/office/2019/extlst" xmlns:r="http://schemas.openxmlformats.org/officeDocument/2006/relationships" xmlns:m="http://schemas.openxmlformats.org/officeDocument/2006/math" xmlns:v="urn:schemas-microsoft-com:vml" xmlns:wp14="http://schemas.microsoft.com/office/word/2010/wordprocessingDrawing" xmlns:wp="http://schemas.openxmlformats.org/drawingml/2006/wordprocessingDrawing" xmlns:w10="urn:schemas-microsoft-com:office:word" xmlns:w="http://schemas.openxmlformats.org/wordprocessingml/2006/main" xmlns:w14="http://schemas.microsoft.com/office/word/2010/wordml" xmlns:w15="http://schemas.microsoft.com/office/word/2012/wordml" xmlns:w16cex="http://schemas.microsoft.com/office/word/2018/wordml/cex" xmlns:w16cid="http://schemas.microsoft.com/office/word/2016/wordml/cid" xmlns:w16="http://schemas.microsoft.com/office/word/2018/wordml" xmlns:w16sdtdh="http://schemas.microsoft.com/office/word/2020/wordml/sdtdatahash" xmlns:w16se="http://schemas.microsoft.com/office/word/2015/wordml/symex" xmlns:wpg="http://schemas.microsoft.com/office/word/2010/wordprocessingGroup" xmlns:wpi="http://schemas.microsoft.com/office/word/2010/wordprocessingInk" xmlns:wne="http://schemas.microsoft.com/office/word/2006/wordml" xmlns:wps="http://schemas.microsoft.com/office/word/2010/wordprocessingShape" mc:Ignorable="w14 w15 w16se w16cid w16 w16cex w16sdtdh wp14">
   <w:body>
     <w:p>
       <w:pPr>
@@ -2578,24 +2578,9 @@
                                 <w:szCs w:val="28"/>
                                 <w:lang w:bidi="fa-IR"/>
                               </w:rPr>
-                              <w:t>_</w:t>
-                            </w:r>
-                            <w:proofErr w:type="gramStart"/>
-                            <w:r>
-                              <w:rPr>
-                                <w:rFonts w:asciiTheme="majorBidi" w:hAnsiTheme="majorBidi" w:cstheme="majorBidi"/>
-                                <w:b/>
-                                <w:bCs/>
-                                <w:i/>
-                                <w:iCs/>
-                                <w:sz w:val="28"/>
-                                <w:szCs w:val="28"/>
-                                <w:lang w:bidi="fa-IR"/>
-                              </w:rPr>
-                              <w:t>output.stdout</w:t>
+                              <w:t>_output.stdout</w:t>
                             </w:r>
                             <w:proofErr w:type="spellEnd"/>
-                            <w:proofErr w:type="gramEnd"/>
                             <w:r>
                               <w:rPr>
                                 <w:rFonts w:asciiTheme="majorBidi" w:hAnsiTheme="majorBidi" w:cstheme="majorBidi"/>
@@ -2951,24 +2936,9 @@
                           <w:szCs w:val="28"/>
                           <w:lang w:bidi="fa-IR"/>
                         </w:rPr>
-                        <w:t>_</w:t>
-                      </w:r>
-                      <w:proofErr w:type="gramStart"/>
-                      <w:r>
-                        <w:rPr>
-                          <w:rFonts w:asciiTheme="majorBidi" w:hAnsiTheme="majorBidi" w:cstheme="majorBidi"/>
-                          <w:b/>
-                          <w:bCs/>
-                          <w:i/>
-                          <w:iCs/>
-                          <w:sz w:val="28"/>
-                          <w:szCs w:val="28"/>
-                          <w:lang w:bidi="fa-IR"/>
-                        </w:rPr>
-                        <w:t>output.stdout</w:t>
+                        <w:t>_output.stdout</w:t>
                       </w:r>
                       <w:proofErr w:type="spellEnd"/>
-                      <w:proofErr w:type="gramEnd"/>
                       <w:r>
                         <w:rPr>
                           <w:rFonts w:asciiTheme="majorBidi" w:hAnsiTheme="majorBidi" w:cstheme="majorBidi"/>
@@ -3180,9 +3150,9 @@
           <w:szCs w:val="28"/>
           <w:lang w:bidi="fa-IR"/>
         </w:rPr>
-        <w:t>_</w:t>
-      </w:r>
-      <w:proofErr w:type="gramStart"/>
+        <w:t>_home</w:t>
+      </w:r>
+      <w:proofErr w:type="spellEnd"/>
       <w:r>
         <w:rPr>
           <w:rFonts w:asciiTheme="majorBidi" w:hAnsiTheme="majorBidi" w:cstheme="majorBidi"/>
@@ -3194,35 +3164,7 @@
           <w:szCs w:val="28"/>
           <w:lang w:bidi="fa-IR"/>
         </w:rPr>
-        <w:t>home</w:t>
-      </w:r>
-      <w:proofErr w:type="spellEnd"/>
-      <w:r>
-        <w:rPr>
-          <w:rFonts w:asciiTheme="majorBidi" w:hAnsiTheme="majorBidi" w:cstheme="majorBidi"/>
-          <w:b/>
-          <w:bCs/>
-          <w:i/>
-          <w:iCs/>
-          <w:sz w:val="28"/>
-          <w:szCs w:val="28"/>
-          <w:lang w:bidi="fa-IR"/>
-        </w:rPr>
-        <w:t xml:space="preserve"> }</w:t>
-      </w:r>
-      <w:proofErr w:type="gramEnd"/>
-      <w:r>
-        <w:rPr>
-          <w:rFonts w:asciiTheme="majorBidi" w:hAnsiTheme="majorBidi" w:cstheme="majorBidi"/>
-          <w:b/>
-          <w:bCs/>
-          <w:i/>
-          <w:iCs/>
-          <w:sz w:val="28"/>
-          <w:szCs w:val="28"/>
-          <w:lang w:bidi="fa-IR"/>
-        </w:rPr>
-        <w:t>}</w:t>
+        <w:t xml:space="preserve"> }}</w:t>
       </w:r>
       <w:r>
         <w:rPr>
@@ -4142,27 +4084,7 @@
           <w:szCs w:val="28"/>
           <w:lang w:bidi="fa-IR"/>
         </w:rPr>
-        <w:t xml:space="preserve"> Check if a custom file exists and </w:t>
-      </w:r>
-      <w:proofErr w:type="gramStart"/>
-      <w:r>
-        <w:rPr>
-          <w:rFonts w:asciiTheme="majorBidi" w:hAnsiTheme="majorBidi" w:cstheme="majorBidi"/>
-          <w:sz w:val="28"/>
-          <w:szCs w:val="28"/>
-          <w:lang w:bidi="fa-IR"/>
-        </w:rPr>
-        <w:t>set</w:t>
-      </w:r>
-      <w:proofErr w:type="gramEnd"/>
-      <w:r>
-        <w:rPr>
-          <w:rFonts w:asciiTheme="majorBidi" w:hAnsiTheme="majorBidi" w:cstheme="majorBidi"/>
-          <w:sz w:val="28"/>
-          <w:szCs w:val="28"/>
-          <w:lang w:bidi="fa-IR"/>
-        </w:rPr>
-        <w:t xml:space="preserve"> a </w:t>
+        <w:t xml:space="preserve"> Check if a custom file exists and set a </w:t>
       </w:r>
       <w:proofErr w:type="spellStart"/>
       <w:r>
@@ -4680,49 +4602,7 @@
                                 <w:szCs w:val="28"/>
                                 <w:lang w:bidi="fa-IR"/>
                               </w:rPr>
-                              <w:t>_file_</w:t>
-                            </w:r>
-                            <w:proofErr w:type="gramStart"/>
-                            <w:r>
-                              <w:rPr>
-                                <w:rFonts w:asciiTheme="majorBidi" w:hAnsiTheme="majorBidi" w:cstheme="majorBidi"/>
-                                <w:b/>
-                                <w:bCs/>
-                                <w:i/>
-                                <w:iCs/>
-                                <w:sz w:val="28"/>
-                                <w:szCs w:val="28"/>
-                                <w:lang w:bidi="fa-IR"/>
-                              </w:rPr>
-                              <w:t>stat.stat</w:t>
-                            </w:r>
-                            <w:proofErr w:type="gramEnd"/>
-                            <w:r>
-                              <w:rPr>
-                                <w:rFonts w:asciiTheme="majorBidi" w:hAnsiTheme="majorBidi" w:cstheme="majorBidi"/>
-                                <w:b/>
-                                <w:bCs/>
-                                <w:i/>
-                                <w:iCs/>
-                                <w:sz w:val="28"/>
-                                <w:szCs w:val="28"/>
-                                <w:lang w:bidi="fa-IR"/>
-                              </w:rPr>
-                              <w:t>.</w:t>
-                            </w:r>
-                            <w:proofErr w:type="gramStart"/>
-                            <w:r>
-                              <w:rPr>
-                                <w:rFonts w:asciiTheme="majorBidi" w:hAnsiTheme="majorBidi" w:cstheme="majorBidi"/>
-                                <w:b/>
-                                <w:bCs/>
-                                <w:i/>
-                                <w:iCs/>
-                                <w:sz w:val="28"/>
-                                <w:szCs w:val="28"/>
-                                <w:lang w:bidi="fa-IR"/>
-                              </w:rPr>
-                              <w:t>exists</w:t>
+                              <w:t>_file_stat.stat.exists</w:t>
                             </w:r>
                             <w:proofErr w:type="spellEnd"/>
                             <w:r>
@@ -4738,7 +4618,6 @@
                               </w:rPr>
                               <w:t xml:space="preserve"> }}"</w:t>
                             </w:r>
-                            <w:proofErr w:type="gramEnd"/>
                           </w:p>
                           <w:p>
                             <w:pPr>
@@ -5360,49 +5239,7 @@
                           <w:szCs w:val="28"/>
                           <w:lang w:bidi="fa-IR"/>
                         </w:rPr>
-                        <w:t>_file_</w:t>
-                      </w:r>
-                      <w:proofErr w:type="gramStart"/>
-                      <w:r>
-                        <w:rPr>
-                          <w:rFonts w:asciiTheme="majorBidi" w:hAnsiTheme="majorBidi" w:cstheme="majorBidi"/>
-                          <w:b/>
-                          <w:bCs/>
-                          <w:i/>
-                          <w:iCs/>
-                          <w:sz w:val="28"/>
-                          <w:szCs w:val="28"/>
-                          <w:lang w:bidi="fa-IR"/>
-                        </w:rPr>
-                        <w:t>stat.stat</w:t>
-                      </w:r>
-                      <w:proofErr w:type="gramEnd"/>
-                      <w:r>
-                        <w:rPr>
-                          <w:rFonts w:asciiTheme="majorBidi" w:hAnsiTheme="majorBidi" w:cstheme="majorBidi"/>
-                          <w:b/>
-                          <w:bCs/>
-                          <w:i/>
-                          <w:iCs/>
-                          <w:sz w:val="28"/>
-                          <w:szCs w:val="28"/>
-                          <w:lang w:bidi="fa-IR"/>
-                        </w:rPr>
-                        <w:t>.</w:t>
-                      </w:r>
-                      <w:proofErr w:type="gramStart"/>
-                      <w:r>
-                        <w:rPr>
-                          <w:rFonts w:asciiTheme="majorBidi" w:hAnsiTheme="majorBidi" w:cstheme="majorBidi"/>
-                          <w:b/>
-                          <w:bCs/>
-                          <w:i/>
-                          <w:iCs/>
-                          <w:sz w:val="28"/>
-                          <w:szCs w:val="28"/>
-                          <w:lang w:bidi="fa-IR"/>
-                        </w:rPr>
-                        <w:t>exists</w:t>
+                        <w:t>_file_stat.stat.exists</w:t>
                       </w:r>
                       <w:proofErr w:type="spellEnd"/>
                       <w:r>
@@ -5418,7 +5255,6 @@
                         </w:rPr>
                         <w:t xml:space="preserve"> }}"</w:t>
                       </w:r>
-                      <w:proofErr w:type="gramEnd"/>
                     </w:p>
                     <w:p>
                       <w:pPr>
@@ -8117,21 +7953,7 @@
                                 <w:szCs w:val="28"/>
                                 <w:lang w:bidi="fa-IR"/>
                               </w:rPr>
-                              <w:t>_</w:t>
-                            </w:r>
-                            <w:proofErr w:type="gramStart"/>
-                            <w:r>
-                              <w:rPr>
-                                <w:rFonts w:asciiTheme="majorBidi" w:hAnsiTheme="majorBidi" w:cstheme="majorBidi"/>
-                                <w:b/>
-                                <w:bCs/>
-                                <w:i/>
-                                <w:iCs/>
-                                <w:sz w:val="28"/>
-                                <w:szCs w:val="28"/>
-                                <w:lang w:bidi="fa-IR"/>
-                              </w:rPr>
-                              <w:t>hostname</w:t>
+                              <w:t>_hostname</w:t>
                             </w:r>
                             <w:proofErr w:type="spellEnd"/>
                             <w:r>
@@ -8147,7 +7969,6 @@
                               </w:rPr>
                               <w:t xml:space="preserve"> }}"</w:t>
                             </w:r>
-                            <w:proofErr w:type="gramEnd"/>
                           </w:p>
                           <w:p>
                             <w:pPr>
@@ -8446,21 +8267,7 @@
                           <w:szCs w:val="28"/>
                           <w:lang w:bidi="fa-IR"/>
                         </w:rPr>
-                        <w:t>_</w:t>
-                      </w:r>
-                      <w:proofErr w:type="gramStart"/>
-                      <w:r>
-                        <w:rPr>
-                          <w:rFonts w:asciiTheme="majorBidi" w:hAnsiTheme="majorBidi" w:cstheme="majorBidi"/>
-                          <w:b/>
-                          <w:bCs/>
-                          <w:i/>
-                          <w:iCs/>
-                          <w:sz w:val="28"/>
-                          <w:szCs w:val="28"/>
-                          <w:lang w:bidi="fa-IR"/>
-                        </w:rPr>
-                        <w:t>hostname</w:t>
+                        <w:t>_hostname</w:t>
                       </w:r>
                       <w:proofErr w:type="spellEnd"/>
                       <w:r>
@@ -8476,7 +8283,6 @@
                         </w:rPr>
                         <w:t xml:space="preserve"> }}"</w:t>
                       </w:r>
-                      <w:proofErr w:type="gramEnd"/>
                     </w:p>
                     <w:p>
                       <w:pPr>
@@ -9527,23 +9333,8 @@
                                 <w:szCs w:val="28"/>
                                 <w:lang w:bidi="fa-IR"/>
                               </w:rPr>
-                              <w:t>_default_</w:t>
+                              <w:t>_default_ipv4.address }}"</w:t>
                             </w:r>
-                            <w:proofErr w:type="gramStart"/>
-                            <w:r>
-                              <w:rPr>
-                                <w:rFonts w:asciiTheme="majorBidi" w:hAnsiTheme="majorBidi" w:cstheme="majorBidi"/>
-                                <w:b/>
-                                <w:bCs/>
-                                <w:i/>
-                                <w:iCs/>
-                                <w:sz w:val="28"/>
-                                <w:szCs w:val="28"/>
-                                <w:lang w:bidi="fa-IR"/>
-                              </w:rPr>
-                              <w:t>ipv4.address }}"</w:t>
-                            </w:r>
-                            <w:proofErr w:type="gramEnd"/>
                           </w:p>
                           <w:p>
                             <w:pPr>
@@ -9801,23 +9592,8 @@
                           <w:szCs w:val="28"/>
                           <w:lang w:bidi="fa-IR"/>
                         </w:rPr>
-                        <w:t>_default_</w:t>
+                        <w:t>_default_ipv4.address }}"</w:t>
                       </w:r>
-                      <w:proofErr w:type="gramStart"/>
-                      <w:r>
-                        <w:rPr>
-                          <w:rFonts w:asciiTheme="majorBidi" w:hAnsiTheme="majorBidi" w:cstheme="majorBidi"/>
-                          <w:b/>
-                          <w:bCs/>
-                          <w:i/>
-                          <w:iCs/>
-                          <w:sz w:val="28"/>
-                          <w:szCs w:val="28"/>
-                          <w:lang w:bidi="fa-IR"/>
-                        </w:rPr>
-                        <w:t>ipv4.address }}"</w:t>
-                      </w:r>
-                      <w:proofErr w:type="gramEnd"/>
                     </w:p>
                     <w:p>
                       <w:pPr>
@@ -10200,21 +9976,7 @@
                                 <w:szCs w:val="28"/>
                                 <w:lang w:bidi="fa-IR"/>
                               </w:rPr>
-                              <w:t>my_</w:t>
-                            </w:r>
-                            <w:proofErr w:type="gramStart"/>
-                            <w:r>
-                              <w:rPr>
-                                <w:rFonts w:asciiTheme="majorBidi" w:hAnsiTheme="majorBidi" w:cstheme="majorBidi"/>
-                                <w:b/>
-                                <w:bCs/>
-                                <w:i/>
-                                <w:iCs/>
-                                <w:sz w:val="28"/>
-                                <w:szCs w:val="28"/>
-                                <w:lang w:bidi="fa-IR"/>
-                              </w:rPr>
-                              <w:t>ip</w:t>
+                              <w:t>my_ip</w:t>
                             </w:r>
                             <w:proofErr w:type="spellEnd"/>
                             <w:r>
@@ -10230,7 +9992,6 @@
                               </w:rPr>
                               <w:t xml:space="preserve"> }}"</w:t>
                             </w:r>
-                            <w:proofErr w:type="gramEnd"/>
                           </w:p>
                           <w:p>
                             <w:pPr>
@@ -10461,21 +10222,7 @@
                           <w:szCs w:val="28"/>
                           <w:lang w:bidi="fa-IR"/>
                         </w:rPr>
-                        <w:t>my_</w:t>
-                      </w:r>
-                      <w:proofErr w:type="gramStart"/>
-                      <w:r>
-                        <w:rPr>
-                          <w:rFonts w:asciiTheme="majorBidi" w:hAnsiTheme="majorBidi" w:cstheme="majorBidi"/>
-                          <w:b/>
-                          <w:bCs/>
-                          <w:i/>
-                          <w:iCs/>
-                          <w:sz w:val="28"/>
-                          <w:szCs w:val="28"/>
-                          <w:lang w:bidi="fa-IR"/>
-                        </w:rPr>
-                        <w:t>ip</w:t>
+                        <w:t>my_ip</w:t>
                       </w:r>
                       <w:proofErr w:type="spellEnd"/>
                       <w:r>
@@ -10491,7 +10238,6 @@
                         </w:rPr>
                         <w:t xml:space="preserve"> }}"</w:t>
                       </w:r>
-                      <w:proofErr w:type="gramEnd"/>
                     </w:p>
                     <w:p>
                       <w:pPr>
@@ -12079,21 +11825,7 @@
                                 <w:szCs w:val="28"/>
                                 <w:lang w:bidi="fa-IR"/>
                               </w:rPr>
-                              <w:t>list_</w:t>
-                            </w:r>
-                            <w:proofErr w:type="gramStart"/>
-                            <w:r>
-                              <w:rPr>
-                                <w:rFonts w:asciiTheme="majorBidi" w:hAnsiTheme="majorBidi" w:cstheme="majorBidi"/>
-                                <w:b/>
-                                <w:bCs/>
-                                <w:i/>
-                                <w:iCs/>
-                                <w:sz w:val="28"/>
-                                <w:szCs w:val="28"/>
-                                <w:lang w:bidi="fa-IR"/>
-                              </w:rPr>
-                              <w:t>b</w:t>
+                              <w:t>list_b</w:t>
                             </w:r>
                             <w:proofErr w:type="spellEnd"/>
                             <w:r>
@@ -12109,7 +11841,6 @@
                               </w:rPr>
                               <w:t xml:space="preserve"> }}"</w:t>
                             </w:r>
-                            <w:proofErr w:type="gramEnd"/>
                           </w:p>
                           <w:p>
                             <w:pPr>
@@ -12320,21 +12051,7 @@
                           <w:szCs w:val="28"/>
                           <w:lang w:bidi="fa-IR"/>
                         </w:rPr>
-                        <w:t>list_</w:t>
-                      </w:r>
-                      <w:proofErr w:type="gramStart"/>
-                      <w:r>
-                        <w:rPr>
-                          <w:rFonts w:asciiTheme="majorBidi" w:hAnsiTheme="majorBidi" w:cstheme="majorBidi"/>
-                          <w:b/>
-                          <w:bCs/>
-                          <w:i/>
-                          <w:iCs/>
-                          <w:sz w:val="28"/>
-                          <w:szCs w:val="28"/>
-                          <w:lang w:bidi="fa-IR"/>
-                        </w:rPr>
-                        <w:t>b</w:t>
+                        <w:t>list_b</w:t>
                       </w:r>
                       <w:proofErr w:type="spellEnd"/>
                       <w:r>
@@ -12350,7 +12067,6 @@
                         </w:rPr>
                         <w:t xml:space="preserve"> }}"</w:t>
                       </w:r>
-                      <w:proofErr w:type="gramEnd"/>
                     </w:p>
                     <w:p>
                       <w:pPr>
@@ -12658,21 +12374,7 @@
                                 <w:szCs w:val="28"/>
                                 <w:lang w:bidi="fa-IR"/>
                               </w:rPr>
-                              <w:t>_calculation_</w:t>
-                            </w:r>
-                            <w:proofErr w:type="gramStart"/>
-                            <w:r>
-                              <w:rPr>
-                                <w:rFonts w:asciiTheme="majorBidi" w:hAnsiTheme="majorBidi" w:cstheme="majorBidi"/>
-                                <w:b/>
-                                <w:bCs/>
-                                <w:i/>
-                                <w:iCs/>
-                                <w:sz w:val="28"/>
-                                <w:szCs w:val="28"/>
-                                <w:lang w:bidi="fa-IR"/>
-                              </w:rPr>
-                              <w:t>result</w:t>
+                              <w:t>_calculation_result</w:t>
                             </w:r>
                             <w:proofErr w:type="spellEnd"/>
                             <w:r>
@@ -12688,7 +12390,6 @@
                               </w:rPr>
                               <w:t xml:space="preserve"> }}"</w:t>
                             </w:r>
-                            <w:proofErr w:type="gramEnd"/>
                           </w:p>
                           <w:p>
                             <w:pPr>
@@ -12890,21 +12591,7 @@
                           <w:szCs w:val="28"/>
                           <w:lang w:bidi="fa-IR"/>
                         </w:rPr>
-                        <w:t>_calculation_</w:t>
-                      </w:r>
-                      <w:proofErr w:type="gramStart"/>
-                      <w:r>
-                        <w:rPr>
-                          <w:rFonts w:asciiTheme="majorBidi" w:hAnsiTheme="majorBidi" w:cstheme="majorBidi"/>
-                          <w:b/>
-                          <w:bCs/>
-                          <w:i/>
-                          <w:iCs/>
-                          <w:sz w:val="28"/>
-                          <w:szCs w:val="28"/>
-                          <w:lang w:bidi="fa-IR"/>
-                        </w:rPr>
-                        <w:t>result</w:t>
+                        <w:t>_calculation_result</w:t>
                       </w:r>
                       <w:proofErr w:type="spellEnd"/>
                       <w:r>
@@ -12920,7 +12607,6 @@
                         </w:rPr>
                         <w:t xml:space="preserve"> }}"</w:t>
                       </w:r>
-                      <w:proofErr w:type="gramEnd"/>
                     </w:p>
                     <w:p>
                       <w:pPr>
@@ -13407,7 +13093,21 @@
                                 <w:szCs w:val="28"/>
                                 <w:lang w:bidi="fa-IR"/>
                               </w:rPr>
-                              <w:t xml:space="preserve">/{{ </w:t>
+                              <w:t>/{</w:t>
+                            </w:r>
+                            <w:proofErr w:type="gramEnd"/>
+                            <w:r>
+                              <w:rPr>
+                                <w:rFonts w:asciiTheme="majorBidi" w:hAnsiTheme="majorBidi" w:cstheme="majorBidi"/>
+                                <w:b/>
+                                <w:bCs/>
+                                <w:i/>
+                                <w:iCs/>
+                                <w:sz w:val="28"/>
+                                <w:szCs w:val="28"/>
+                                <w:lang w:bidi="fa-IR"/>
+                              </w:rPr>
+                              <w:t xml:space="preserve">{ </w:t>
                             </w:r>
                             <w:proofErr w:type="spellStart"/>
                             <w:r>
@@ -13421,35 +13121,7 @@
                                 <w:szCs w:val="28"/>
                                 <w:lang w:bidi="fa-IR"/>
                               </w:rPr>
-                              <w:t>app</w:t>
-                            </w:r>
-                            <w:proofErr w:type="gramEnd"/>
-                            <w:r>
-                              <w:rPr>
-                                <w:rFonts w:asciiTheme="majorBidi" w:hAnsiTheme="majorBidi" w:cstheme="majorBidi"/>
-                                <w:b/>
-                                <w:bCs/>
-                                <w:i/>
-                                <w:iCs/>
-                                <w:sz w:val="28"/>
-                                <w:szCs w:val="28"/>
-                                <w:lang w:bidi="fa-IR"/>
-                              </w:rPr>
-                              <w:t>_</w:t>
-                            </w:r>
-                            <w:proofErr w:type="gramStart"/>
-                            <w:r>
-                              <w:rPr>
-                                <w:rFonts w:asciiTheme="majorBidi" w:hAnsiTheme="majorBidi" w:cstheme="majorBidi"/>
-                                <w:b/>
-                                <w:bCs/>
-                                <w:i/>
-                                <w:iCs/>
-                                <w:sz w:val="28"/>
-                                <w:szCs w:val="28"/>
-                                <w:lang w:bidi="fa-IR"/>
-                              </w:rPr>
-                              <w:t>name</w:t>
+                              <w:t>app_name</w:t>
                             </w:r>
                             <w:proofErr w:type="spellEnd"/>
                             <w:r>
@@ -13465,7 +13137,6 @@
                               </w:rPr>
                               <w:t xml:space="preserve"> }}"</w:t>
                             </w:r>
-                            <w:proofErr w:type="gramEnd"/>
                           </w:p>
                           <w:p>
                             <w:pPr>
@@ -13655,7 +13326,21 @@
                           <w:szCs w:val="28"/>
                           <w:lang w:bidi="fa-IR"/>
                         </w:rPr>
-                        <w:t xml:space="preserve">/{{ </w:t>
+                        <w:t>/{</w:t>
+                      </w:r>
+                      <w:proofErr w:type="gramEnd"/>
+                      <w:r>
+                        <w:rPr>
+                          <w:rFonts w:asciiTheme="majorBidi" w:hAnsiTheme="majorBidi" w:cstheme="majorBidi"/>
+                          <w:b/>
+                          <w:bCs/>
+                          <w:i/>
+                          <w:iCs/>
+                          <w:sz w:val="28"/>
+                          <w:szCs w:val="28"/>
+                          <w:lang w:bidi="fa-IR"/>
+                        </w:rPr>
+                        <w:t xml:space="preserve">{ </w:t>
                       </w:r>
                       <w:proofErr w:type="spellStart"/>
                       <w:r>
@@ -13669,35 +13354,7 @@
                           <w:szCs w:val="28"/>
                           <w:lang w:bidi="fa-IR"/>
                         </w:rPr>
-                        <w:t>app</w:t>
-                      </w:r>
-                      <w:proofErr w:type="gramEnd"/>
-                      <w:r>
-                        <w:rPr>
-                          <w:rFonts w:asciiTheme="majorBidi" w:hAnsiTheme="majorBidi" w:cstheme="majorBidi"/>
-                          <w:b/>
-                          <w:bCs/>
-                          <w:i/>
-                          <w:iCs/>
-                          <w:sz w:val="28"/>
-                          <w:szCs w:val="28"/>
-                          <w:lang w:bidi="fa-IR"/>
-                        </w:rPr>
-                        <w:t>_</w:t>
-                      </w:r>
-                      <w:proofErr w:type="gramStart"/>
-                      <w:r>
-                        <w:rPr>
-                          <w:rFonts w:asciiTheme="majorBidi" w:hAnsiTheme="majorBidi" w:cstheme="majorBidi"/>
-                          <w:b/>
-                          <w:bCs/>
-                          <w:i/>
-                          <w:iCs/>
-                          <w:sz w:val="28"/>
-                          <w:szCs w:val="28"/>
-                          <w:lang w:bidi="fa-IR"/>
-                        </w:rPr>
-                        <w:t>name</w:t>
+                        <w:t>app_name</w:t>
                       </w:r>
                       <w:proofErr w:type="spellEnd"/>
                       <w:r>
@@ -13713,7 +13370,6 @@
                         </w:rPr>
                         <w:t xml:space="preserve"> }}"</w:t>
                       </w:r>
-                      <w:proofErr w:type="gramEnd"/>
                     </w:p>
                     <w:p>
                       <w:pPr>
@@ -14842,9 +14498,9 @@
           <w:szCs w:val="28"/>
           <w:lang w:bidi="fa-IR"/>
         </w:rPr>
-        <w:t>.</w:t>
-      </w:r>
-      <w:proofErr w:type="gramStart"/>
+        <w:t>.admin.shell</w:t>
+      </w:r>
+      <w:proofErr w:type="spellEnd"/>
       <w:r>
         <w:rPr>
           <w:rFonts w:asciiTheme="majorBidi" w:hAnsiTheme="majorBidi" w:cstheme="majorBidi"/>
@@ -14856,10 +14512,17 @@
           <w:szCs w:val="28"/>
           <w:lang w:bidi="fa-IR"/>
         </w:rPr>
-        <w:t>admin.shell</w:t>
-      </w:r>
-      <w:proofErr w:type="spellEnd"/>
-      <w:proofErr w:type="gramEnd"/>
+        <w:t xml:space="preserve"> }}</w:t>
+      </w:r>
+      <w:r>
+        <w:rPr>
+          <w:rFonts w:asciiTheme="majorBidi" w:hAnsiTheme="majorBidi" w:cstheme="majorBidi"/>
+          <w:sz w:val="28"/>
+          <w:szCs w:val="28"/>
+          <w:lang w:bidi="fa-IR"/>
+        </w:rPr>
+        <w:t xml:space="preserve"> or </w:t>
+      </w:r>
       <w:r>
         <w:rPr>
           <w:rFonts w:asciiTheme="majorBidi" w:hAnsiTheme="majorBidi" w:cstheme="majorBidi"/>
@@ -14871,100 +14534,7 @@
           <w:szCs w:val="28"/>
           <w:lang w:bidi="fa-IR"/>
         </w:rPr>
-        <w:t xml:space="preserve"> }}</w:t>
-      </w:r>
-      <w:r>
-        <w:rPr>
-          <w:rFonts w:asciiTheme="majorBidi" w:hAnsiTheme="majorBidi" w:cstheme="majorBidi"/>
-          <w:sz w:val="28"/>
-          <w:szCs w:val="28"/>
-          <w:lang w:bidi="fa-IR"/>
-        </w:rPr>
-        <w:t xml:space="preserve"> or </w:t>
-      </w:r>
-      <w:proofErr w:type="gramStart"/>
-      <w:r>
-        <w:rPr>
-          <w:rFonts w:asciiTheme="majorBidi" w:hAnsiTheme="majorBidi" w:cstheme="majorBidi"/>
-          <w:b/>
-          <w:bCs/>
-          <w:i/>
-          <w:iCs/>
-          <w:sz w:val="28"/>
-          <w:szCs w:val="28"/>
-          <w:lang w:bidi="fa-IR"/>
-        </w:rPr>
-        <w:t>{{ users</w:t>
-      </w:r>
-      <w:proofErr w:type="gramEnd"/>
-      <w:r>
-        <w:rPr>
-          <w:rFonts w:asciiTheme="majorBidi" w:hAnsiTheme="majorBidi" w:cstheme="majorBidi"/>
-          <w:b/>
-          <w:bCs/>
-          <w:i/>
-          <w:iCs/>
-          <w:sz w:val="28"/>
-          <w:szCs w:val="28"/>
-          <w:lang w:bidi="fa-IR"/>
-        </w:rPr>
-        <w:t>['admin</w:t>
-      </w:r>
-      <w:proofErr w:type="gramStart"/>
-      <w:r>
-        <w:rPr>
-          <w:rFonts w:asciiTheme="majorBidi" w:hAnsiTheme="majorBidi" w:cstheme="majorBidi"/>
-          <w:b/>
-          <w:bCs/>
-          <w:i/>
-          <w:iCs/>
-          <w:sz w:val="28"/>
-          <w:szCs w:val="28"/>
-          <w:lang w:bidi="fa-IR"/>
-        </w:rPr>
-        <w:t>'][</w:t>
-      </w:r>
-      <w:proofErr w:type="gramEnd"/>
-      <w:r>
-        <w:rPr>
-          <w:rFonts w:asciiTheme="majorBidi" w:hAnsiTheme="majorBidi" w:cstheme="majorBidi"/>
-          <w:b/>
-          <w:bCs/>
-          <w:i/>
-          <w:iCs/>
-          <w:sz w:val="28"/>
-          <w:szCs w:val="28"/>
-          <w:lang w:bidi="fa-IR"/>
-        </w:rPr>
-        <w:t>'shell'</w:t>
-      </w:r>
-      <w:proofErr w:type="gramStart"/>
-      <w:r>
-        <w:rPr>
-          <w:rFonts w:asciiTheme="majorBidi" w:hAnsiTheme="majorBidi" w:cstheme="majorBidi"/>
-          <w:b/>
-          <w:bCs/>
-          <w:i/>
-          <w:iCs/>
-          <w:sz w:val="28"/>
-          <w:szCs w:val="28"/>
-          <w:lang w:bidi="fa-IR"/>
-        </w:rPr>
-        <w:t>] }</w:t>
-      </w:r>
-      <w:proofErr w:type="gramEnd"/>
-      <w:r>
-        <w:rPr>
-          <w:rFonts w:asciiTheme="majorBidi" w:hAnsiTheme="majorBidi" w:cstheme="majorBidi"/>
-          <w:b/>
-          <w:bCs/>
-          <w:i/>
-          <w:iCs/>
-          <w:sz w:val="28"/>
-          <w:szCs w:val="28"/>
-          <w:lang w:bidi="fa-IR"/>
-        </w:rPr>
-        <w:t>}</w:t>
+        <w:t>{{ users['admin']['shell'] }}</w:t>
       </w:r>
       <w:r>
         <w:rPr>
@@ -15186,51 +14756,8 @@
                                 <w:szCs w:val="28"/>
                                 <w:lang w:bidi="fa-IR"/>
                               </w:rPr>
-                              <w:t xml:space="preserve"> | </w:t>
+                              <w:t xml:space="preserve"> | join(', ') }}"</w:t>
                             </w:r>
-                            <w:proofErr w:type="gramStart"/>
-                            <w:r>
-                              <w:rPr>
-                                <w:rFonts w:asciiTheme="majorBidi" w:hAnsiTheme="majorBidi" w:cstheme="majorBidi"/>
-                                <w:b/>
-                                <w:bCs/>
-                                <w:i/>
-                                <w:iCs/>
-                                <w:sz w:val="28"/>
-                                <w:szCs w:val="28"/>
-                                <w:lang w:bidi="fa-IR"/>
-                              </w:rPr>
-                              <w:t>join(</w:t>
-                            </w:r>
-                            <w:proofErr w:type="gramEnd"/>
-                            <w:r>
-                              <w:rPr>
-                                <w:rFonts w:asciiTheme="majorBidi" w:hAnsiTheme="majorBidi" w:cstheme="majorBidi"/>
-                                <w:b/>
-                                <w:bCs/>
-                                <w:i/>
-                                <w:iCs/>
-                                <w:sz w:val="28"/>
-                                <w:szCs w:val="28"/>
-                                <w:lang w:bidi="fa-IR"/>
-                              </w:rPr>
-                              <w:t>', '</w:t>
-                            </w:r>
-                            <w:proofErr w:type="gramStart"/>
-                            <w:r>
-                              <w:rPr>
-                                <w:rFonts w:asciiTheme="majorBidi" w:hAnsiTheme="majorBidi" w:cstheme="majorBidi"/>
-                                <w:b/>
-                                <w:bCs/>
-                                <w:i/>
-                                <w:iCs/>
-                                <w:sz w:val="28"/>
-                                <w:szCs w:val="28"/>
-                                <w:lang w:bidi="fa-IR"/>
-                              </w:rPr>
-                              <w:t>) }}"</w:t>
-                            </w:r>
-                            <w:proofErr w:type="gramEnd"/>
                           </w:p>
                           <w:p>
                             <w:pPr>
@@ -15371,51 +14898,8 @@
                           <w:szCs w:val="28"/>
                           <w:lang w:bidi="fa-IR"/>
                         </w:rPr>
-                        <w:t xml:space="preserve"> | </w:t>
+                        <w:t xml:space="preserve"> | join(', ') }}"</w:t>
                       </w:r>
-                      <w:proofErr w:type="gramStart"/>
-                      <w:r>
-                        <w:rPr>
-                          <w:rFonts w:asciiTheme="majorBidi" w:hAnsiTheme="majorBidi" w:cstheme="majorBidi"/>
-                          <w:b/>
-                          <w:bCs/>
-                          <w:i/>
-                          <w:iCs/>
-                          <w:sz w:val="28"/>
-                          <w:szCs w:val="28"/>
-                          <w:lang w:bidi="fa-IR"/>
-                        </w:rPr>
-                        <w:t>join(</w:t>
-                      </w:r>
-                      <w:proofErr w:type="gramEnd"/>
-                      <w:r>
-                        <w:rPr>
-                          <w:rFonts w:asciiTheme="majorBidi" w:hAnsiTheme="majorBidi" w:cstheme="majorBidi"/>
-                          <w:b/>
-                          <w:bCs/>
-                          <w:i/>
-                          <w:iCs/>
-                          <w:sz w:val="28"/>
-                          <w:szCs w:val="28"/>
-                          <w:lang w:bidi="fa-IR"/>
-                        </w:rPr>
-                        <w:t>', '</w:t>
-                      </w:r>
-                      <w:proofErr w:type="gramStart"/>
-                      <w:r>
-                        <w:rPr>
-                          <w:rFonts w:asciiTheme="majorBidi" w:hAnsiTheme="majorBidi" w:cstheme="majorBidi"/>
-                          <w:b/>
-                          <w:bCs/>
-                          <w:i/>
-                          <w:iCs/>
-                          <w:sz w:val="28"/>
-                          <w:szCs w:val="28"/>
-                          <w:lang w:bidi="fa-IR"/>
-                        </w:rPr>
-                        <w:t>) }}"</w:t>
-                      </w:r>
-                      <w:proofErr w:type="gramEnd"/>
                     </w:p>
                     <w:p>
                       <w:pPr>
@@ -15860,27 +15344,7 @@
           <w:szCs w:val="28"/>
           <w:lang w:bidi="fa-IR"/>
         </w:rPr>
-        <w:t xml:space="preserve">. </w:t>
-      </w:r>
-      <w:proofErr w:type="gramStart"/>
-      <w:r>
-        <w:rPr>
-          <w:rFonts w:asciiTheme="majorBidi" w:hAnsiTheme="majorBidi" w:cstheme="majorBidi"/>
-          <w:sz w:val="28"/>
-          <w:szCs w:val="28"/>
-          <w:lang w:bidi="fa-IR"/>
-        </w:rPr>
-        <w:t>so</w:t>
-      </w:r>
-      <w:proofErr w:type="gramEnd"/>
-      <w:r>
-        <w:rPr>
-          <w:rFonts w:asciiTheme="majorBidi" w:hAnsiTheme="majorBidi" w:cstheme="majorBidi"/>
-          <w:sz w:val="28"/>
-          <w:szCs w:val="28"/>
-          <w:lang w:bidi="fa-IR"/>
-        </w:rPr>
-        <w:t xml:space="preserve"> the result </w:t>
+        <w:t xml:space="preserve">. so the result </w:t>
       </w:r>
       <w:proofErr w:type="gramStart"/>
       <w:r>
@@ -16304,35 +15768,7 @@
           <w:szCs w:val="28"/>
           <w:lang w:bidi="fa-IR"/>
         </w:rPr>
-        <w:t xml:space="preserve"> | filter1 | filter</w:t>
-      </w:r>
-      <w:proofErr w:type="gramStart"/>
-      <w:r>
-        <w:rPr>
-          <w:rFonts w:asciiTheme="majorBidi" w:hAnsiTheme="majorBidi" w:cstheme="majorBidi"/>
-          <w:b/>
-          <w:bCs/>
-          <w:i/>
-          <w:iCs/>
-          <w:sz w:val="28"/>
-          <w:szCs w:val="28"/>
-          <w:lang w:bidi="fa-IR"/>
-        </w:rPr>
-        <w:t>2 }</w:t>
-      </w:r>
-      <w:proofErr w:type="gramEnd"/>
-      <w:r>
-        <w:rPr>
-          <w:rFonts w:asciiTheme="majorBidi" w:hAnsiTheme="majorBidi" w:cstheme="majorBidi"/>
-          <w:b/>
-          <w:bCs/>
-          <w:i/>
-          <w:iCs/>
-          <w:sz w:val="28"/>
-          <w:szCs w:val="28"/>
-          <w:lang w:bidi="fa-IR"/>
-        </w:rPr>
-        <w:t>}</w:t>
+        <w:t xml:space="preserve"> | filter1 | filter2 }}</w:t>
       </w:r>
     </w:p>
     <w:p>
@@ -16456,35 +15892,7 @@
           <w:szCs w:val="28"/>
           <w:lang w:bidi="fa-IR"/>
         </w:rPr>
-        <w:t xml:space="preserve"> | default('fallback'</w:t>
-      </w:r>
-      <w:proofErr w:type="gramStart"/>
-      <w:r>
-        <w:rPr>
-          <w:rFonts w:asciiTheme="majorBidi" w:hAnsiTheme="majorBidi" w:cstheme="majorBidi"/>
-          <w:b/>
-          <w:bCs/>
-          <w:i/>
-          <w:iCs/>
-          <w:sz w:val="28"/>
-          <w:szCs w:val="28"/>
-          <w:lang w:bidi="fa-IR"/>
-        </w:rPr>
-        <w:t>) }</w:t>
-      </w:r>
-      <w:proofErr w:type="gramEnd"/>
-      <w:r>
-        <w:rPr>
-          <w:rFonts w:asciiTheme="majorBidi" w:hAnsiTheme="majorBidi" w:cstheme="majorBidi"/>
-          <w:b/>
-          <w:bCs/>
-          <w:i/>
-          <w:iCs/>
-          <w:sz w:val="28"/>
-          <w:szCs w:val="28"/>
-          <w:lang w:bidi="fa-IR"/>
-        </w:rPr>
-        <w:t>}</w:t>
+        <w:t xml:space="preserve"> | default('fallback') }}</w:t>
       </w:r>
       <w:r>
         <w:rPr>
@@ -16740,35 +16148,7 @@
           <w:szCs w:val="28"/>
           <w:lang w:bidi="fa-IR"/>
         </w:rPr>
-        <w:t xml:space="preserve">nginx' | </w:t>
-      </w:r>
-      <w:proofErr w:type="gramStart"/>
-      <w:r>
-        <w:rPr>
-          <w:rFonts w:asciiTheme="majorBidi" w:hAnsiTheme="majorBidi" w:cstheme="majorBidi"/>
-          <w:b/>
-          <w:bCs/>
-          <w:i/>
-          <w:iCs/>
-          <w:sz w:val="28"/>
-          <w:szCs w:val="28"/>
-          <w:lang w:bidi="fa-IR"/>
-        </w:rPr>
-        <w:t>upper }</w:t>
-      </w:r>
-      <w:proofErr w:type="gramEnd"/>
-      <w:r>
-        <w:rPr>
-          <w:rFonts w:asciiTheme="majorBidi" w:hAnsiTheme="majorBidi" w:cstheme="majorBidi"/>
-          <w:b/>
-          <w:bCs/>
-          <w:i/>
-          <w:iCs/>
-          <w:sz w:val="28"/>
-          <w:szCs w:val="28"/>
-          <w:lang w:bidi="fa-IR"/>
-        </w:rPr>
-        <w:t>}</w:t>
+        <w:t>nginx' | upper }}</w:t>
       </w:r>
     </w:p>
     <w:p>
@@ -17569,35 +16949,7 @@
           <w:szCs w:val="28"/>
           <w:lang w:bidi="fa-IR"/>
         </w:rPr>
-        <w:t xml:space="preserve"> | map(attribute='name') | </w:t>
-      </w:r>
-      <w:proofErr w:type="gramStart"/>
-      <w:r>
-        <w:rPr>
-          <w:rFonts w:asciiTheme="majorBidi" w:hAnsiTheme="majorBidi" w:cstheme="majorBidi"/>
-          <w:b/>
-          <w:bCs/>
-          <w:i/>
-          <w:iCs/>
-          <w:sz w:val="28"/>
-          <w:szCs w:val="28"/>
-          <w:lang w:bidi="fa-IR"/>
-        </w:rPr>
-        <w:t>list }</w:t>
-      </w:r>
-      <w:proofErr w:type="gramEnd"/>
-      <w:r>
-        <w:rPr>
-          <w:rFonts w:asciiTheme="majorBidi" w:hAnsiTheme="majorBidi" w:cstheme="majorBidi"/>
-          <w:b/>
-          <w:bCs/>
-          <w:i/>
-          <w:iCs/>
-          <w:sz w:val="28"/>
-          <w:szCs w:val="28"/>
-          <w:lang w:bidi="fa-IR"/>
-        </w:rPr>
-        <w:t>}</w:t>
+        <w:t xml:space="preserve"> | map(attribute='name') | list }}</w:t>
       </w:r>
     </w:p>
     <w:p>
@@ -18400,7 +17752,6 @@
         <w:t xml:space="preserve"> | </w:t>
       </w:r>
       <w:proofErr w:type="spellStart"/>
-      <w:proofErr w:type="gramStart"/>
       <w:r>
         <w:rPr>
           <w:rFonts w:asciiTheme="majorBidi" w:hAnsiTheme="majorBidi" w:cstheme="majorBidi"/>
@@ -18426,9 +17777,9 @@
           <w:szCs w:val="28"/>
           <w:lang w:bidi="fa-IR"/>
         </w:rPr>
-        <w:t>(</w:t>
-      </w:r>
-      <w:proofErr w:type="gramEnd"/>
+        <w:t>('type', '</w:t>
+      </w:r>
+      <w:proofErr w:type="spellStart"/>
       <w:r>
         <w:rPr>
           <w:rFonts w:asciiTheme="majorBidi" w:hAnsiTheme="majorBidi" w:cstheme="majorBidi"/>
@@ -18440,9 +17791,9 @@
           <w:szCs w:val="28"/>
           <w:lang w:bidi="fa-IR"/>
         </w:rPr>
-        <w:t>'type', '</w:t>
-      </w:r>
-      <w:proofErr w:type="spellStart"/>
+        <w:t>equalto</w:t>
+      </w:r>
+      <w:proofErr w:type="spellEnd"/>
       <w:r>
         <w:rPr>
           <w:rFonts w:asciiTheme="majorBidi" w:hAnsiTheme="majorBidi" w:cstheme="majorBidi"/>
@@ -18454,10 +17805,40 @@
           <w:szCs w:val="28"/>
           <w:lang w:bidi="fa-IR"/>
         </w:rPr>
-        <w:t>equalto</w:t>
-      </w:r>
-      <w:proofErr w:type="spellEnd"/>
-      <w:r>
+        <w:t>', 'public') | list }}</w:t>
+      </w:r>
+    </w:p>
+    <w:p>
+      <w:pPr>
+        <w:spacing w:after="60"/>
+        <w:ind w:left="360"/>
+        <w:jc w:val="both"/>
+        <w:rPr>
+          <w:rFonts w:asciiTheme="majorBidi" w:hAnsiTheme="majorBidi" w:cstheme="majorBidi"/>
+          <w:b/>
+          <w:bCs/>
+          <w:sz w:val="28"/>
+          <w:szCs w:val="28"/>
+          <w:lang w:bidi="fa-IR"/>
+        </w:rPr>
+      </w:pPr>
+      <w:r>
+        <w:rPr>
+          <w:rFonts w:asciiTheme="majorBidi" w:hAnsiTheme="majorBidi" w:cstheme="majorBidi"/>
+          <w:b/>
+          <w:bCs/>
+          <w:sz w:val="28"/>
+          <w:szCs w:val="28"/>
+          <w:lang w:bidi="fa-IR"/>
+        </w:rPr>
+        <w:t>Result:</w:t>
+      </w:r>
+    </w:p>
+    <w:p>
+      <w:pPr>
+        <w:spacing w:after="80"/>
+        <w:ind w:left="360"/>
+        <w:jc w:val="both"/>
         <w:rPr>
           <w:rFonts w:asciiTheme="majorBidi" w:hAnsiTheme="majorBidi" w:cstheme="majorBidi"/>
           <w:b/>
@@ -18468,9 +17849,7 @@
           <w:szCs w:val="28"/>
           <w:lang w:bidi="fa-IR"/>
         </w:rPr>
-        <w:t xml:space="preserve">', 'public') | </w:t>
-      </w:r>
-      <w:proofErr w:type="gramStart"/>
+      </w:pPr>
       <w:r>
         <w:rPr>
           <w:rFonts w:asciiTheme="majorBidi" w:hAnsiTheme="majorBidi" w:cstheme="majorBidi"/>
@@ -18482,9 +17861,9 @@
           <w:szCs w:val="28"/>
           <w:lang w:bidi="fa-IR"/>
         </w:rPr>
-        <w:t>list }</w:t>
-      </w:r>
-      <w:proofErr w:type="gramEnd"/>
+        <w:t xml:space="preserve">[ </w:t>
+      </w:r>
+      <w:proofErr w:type="gramStart"/>
       <w:r>
         <w:rPr>
           <w:rFonts w:asciiTheme="majorBidi" w:hAnsiTheme="majorBidi" w:cstheme="majorBidi"/>
@@ -18496,40 +17875,10 @@
           <w:szCs w:val="28"/>
           <w:lang w:bidi="fa-IR"/>
         </w:rPr>
-        <w:t>}</w:t>
-      </w:r>
-    </w:p>
-    <w:p>
-      <w:pPr>
-        <w:spacing w:after="60"/>
-        <w:ind w:left="360"/>
-        <w:jc w:val="both"/>
-        <w:rPr>
-          <w:rFonts w:asciiTheme="majorBidi" w:hAnsiTheme="majorBidi" w:cstheme="majorBidi"/>
-          <w:b/>
-          <w:bCs/>
-          <w:sz w:val="28"/>
-          <w:szCs w:val="28"/>
-          <w:lang w:bidi="fa-IR"/>
-        </w:rPr>
-      </w:pPr>
-      <w:r>
-        <w:rPr>
-          <w:rFonts w:asciiTheme="majorBidi" w:hAnsiTheme="majorBidi" w:cstheme="majorBidi"/>
-          <w:b/>
-          <w:bCs/>
-          <w:sz w:val="28"/>
-          <w:szCs w:val="28"/>
-          <w:lang w:bidi="fa-IR"/>
-        </w:rPr>
-        <w:t>Result:</w:t>
-      </w:r>
-    </w:p>
-    <w:p>
-      <w:pPr>
-        <w:spacing w:after="80"/>
-        <w:ind w:left="360"/>
-        <w:jc w:val="both"/>
+        <w:t>{ "</w:t>
+      </w:r>
+      <w:proofErr w:type="gramEnd"/>
+      <w:r>
         <w:rPr>
           <w:rFonts w:asciiTheme="majorBidi" w:hAnsiTheme="majorBidi" w:cstheme="majorBidi"/>
           <w:b/>
@@ -18540,7 +17889,31 @@
           <w:szCs w:val="28"/>
           <w:lang w:bidi="fa-IR"/>
         </w:rPr>
-      </w:pPr>
+        <w:t>name": "eth0", "type": "public" } ]</w:t>
+      </w:r>
+    </w:p>
+    <w:p>
+      <w:pPr>
+        <w:spacing w:after="100"/>
+        <w:ind w:left="360"/>
+        <w:jc w:val="both"/>
+        <w:rPr>
+          <w:rFonts w:asciiTheme="majorBidi" w:hAnsiTheme="majorBidi" w:cstheme="majorBidi"/>
+          <w:sz w:val="28"/>
+          <w:szCs w:val="28"/>
+          <w:lang w:bidi="fa-IR"/>
+        </w:rPr>
+      </w:pPr>
+      <w:r>
+        <w:rPr>
+          <w:rFonts w:asciiTheme="majorBidi" w:hAnsiTheme="majorBidi" w:cstheme="majorBidi"/>
+          <w:sz w:val="28"/>
+          <w:szCs w:val="28"/>
+          <w:lang w:bidi="fa-IR"/>
+        </w:rPr>
+        <w:t xml:space="preserve">So </w:t>
+      </w:r>
+      <w:proofErr w:type="spellStart"/>
       <w:r>
         <w:rPr>
           <w:rFonts w:asciiTheme="majorBidi" w:hAnsiTheme="majorBidi" w:cstheme="majorBidi"/>
@@ -18552,9 +17925,9 @@
           <w:szCs w:val="28"/>
           <w:lang w:bidi="fa-IR"/>
         </w:rPr>
-        <w:t xml:space="preserve">[ </w:t>
-      </w:r>
-      <w:proofErr w:type="gramStart"/>
+        <w:t>selectattr</w:t>
+      </w:r>
+      <w:proofErr w:type="spellEnd"/>
       <w:r>
         <w:rPr>
           <w:rFonts w:asciiTheme="majorBidi" w:hAnsiTheme="majorBidi" w:cstheme="majorBidi"/>
@@ -18566,9 +17939,35 @@
           <w:szCs w:val="28"/>
           <w:lang w:bidi="fa-IR"/>
         </w:rPr>
-        <w:t>{ "</w:t>
-      </w:r>
-      <w:proofErr w:type="gramEnd"/>
+        <w:t xml:space="preserve"> =</w:t>
+      </w:r>
+      <w:r>
+        <w:rPr>
+          <w:rFonts w:asciiTheme="majorBidi" w:hAnsiTheme="majorBidi" w:cstheme="majorBidi"/>
+          <w:sz w:val="28"/>
+          <w:szCs w:val="28"/>
+          <w:lang w:bidi="fa-IR"/>
+        </w:rPr>
+        <w:t xml:space="preserve"> “filter this list to only items whose attribute matches a condition.”</w:t>
+      </w:r>
+    </w:p>
+    <w:p>
+      <w:pPr>
+        <w:pStyle w:val="ListParagraph"/>
+        <w:numPr>
+          <w:ilvl w:val="0"/>
+          <w:numId w:val="21"/>
+        </w:numPr>
+        <w:spacing w:after="100"/>
+        <w:ind w:left="360"/>
+        <w:rPr>
+          <w:rFonts w:asciiTheme="majorBidi" w:hAnsiTheme="majorBidi" w:cstheme="majorBidi"/>
+          <w:sz w:val="28"/>
+          <w:szCs w:val="28"/>
+          <w:lang w:bidi="fa-IR"/>
+        </w:rPr>
+      </w:pPr>
+      <w:proofErr w:type="spellStart"/>
       <w:r>
         <w:rPr>
           <w:rFonts w:asciiTheme="majorBidi" w:hAnsiTheme="majorBidi" w:cstheme="majorBidi"/>
@@ -18580,9 +17979,19 @@
           <w:szCs w:val="28"/>
           <w:lang w:bidi="fa-IR"/>
         </w:rPr>
-        <w:t>name": "eth0", "type": "public</w:t>
-      </w:r>
-      <w:proofErr w:type="gramStart"/>
+        <w:t>rejectattr</w:t>
+      </w:r>
+      <w:proofErr w:type="spellEnd"/>
+      <w:r>
+        <w:rPr>
+          <w:rFonts w:asciiTheme="majorBidi" w:hAnsiTheme="majorBidi" w:cstheme="majorBidi"/>
+          <w:sz w:val="28"/>
+          <w:szCs w:val="28"/>
+          <w:lang w:bidi="fa-IR"/>
+        </w:rPr>
+        <w:t xml:space="preserve"> is the logical inverse of </w:t>
+      </w:r>
+      <w:proofErr w:type="spellStart"/>
       <w:r>
         <w:rPr>
           <w:rFonts w:asciiTheme="majorBidi" w:hAnsiTheme="majorBidi" w:cstheme="majorBidi"/>
@@ -18594,9 +18003,37 @@
           <w:szCs w:val="28"/>
           <w:lang w:bidi="fa-IR"/>
         </w:rPr>
-        <w:t>" }</w:t>
-      </w:r>
-      <w:proofErr w:type="gramEnd"/>
+        <w:t>selectattr</w:t>
+      </w:r>
+      <w:proofErr w:type="spellEnd"/>
+      <w:r>
+        <w:rPr>
+          <w:rFonts w:asciiTheme="majorBidi" w:hAnsiTheme="majorBidi" w:cstheme="majorBidi"/>
+          <w:sz w:val="28"/>
+          <w:szCs w:val="28"/>
+          <w:lang w:bidi="fa-IR"/>
+        </w:rPr>
+        <w:t>.</w:t>
+      </w:r>
+      <w:r>
+        <w:rPr>
+          <w:rFonts w:asciiTheme="majorBidi" w:hAnsiTheme="majorBidi" w:cstheme="majorBidi"/>
+          <w:sz w:val="28"/>
+          <w:szCs w:val="28"/>
+          <w:lang w:bidi="fa-IR"/>
+        </w:rPr>
+        <w:t xml:space="preserve"> </w:t>
+      </w:r>
+      <w:r>
+        <w:rPr>
+          <w:rFonts w:asciiTheme="majorBidi" w:hAnsiTheme="majorBidi" w:cstheme="majorBidi"/>
+          <w:sz w:val="28"/>
+          <w:szCs w:val="28"/>
+          <w:lang w:bidi="fa-IR"/>
+        </w:rPr>
+        <w:t xml:space="preserve">While </w:t>
+      </w:r>
+      <w:proofErr w:type="spellStart"/>
       <w:r>
         <w:rPr>
           <w:rFonts w:asciiTheme="majorBidi" w:hAnsiTheme="majorBidi" w:cstheme="majorBidi"/>
@@ -18608,30 +18045,803 @@
           <w:szCs w:val="28"/>
           <w:lang w:bidi="fa-IR"/>
         </w:rPr>
-        <w:t xml:space="preserve"> ]</w:t>
+        <w:t>selectattr</w:t>
+      </w:r>
+      <w:proofErr w:type="spellEnd"/>
+      <w:r>
+        <w:rPr>
+          <w:rFonts w:asciiTheme="majorBidi" w:hAnsiTheme="majorBidi" w:cstheme="majorBidi"/>
+          <w:sz w:val="28"/>
+          <w:szCs w:val="28"/>
+          <w:lang w:bidi="fa-IR"/>
+        </w:rPr>
+        <w:t xml:space="preserve"> keeps items that match your criteria, </w:t>
+      </w:r>
+      <w:proofErr w:type="spellStart"/>
+      <w:r>
+        <w:rPr>
+          <w:rFonts w:asciiTheme="majorBidi" w:hAnsiTheme="majorBidi" w:cstheme="majorBidi"/>
+          <w:b/>
+          <w:bCs/>
+          <w:i/>
+          <w:iCs/>
+          <w:sz w:val="28"/>
+          <w:szCs w:val="28"/>
+          <w:lang w:bidi="fa-IR"/>
+        </w:rPr>
+        <w:t>rejectattr</w:t>
+      </w:r>
+      <w:proofErr w:type="spellEnd"/>
+      <w:r>
+        <w:rPr>
+          <w:rFonts w:asciiTheme="majorBidi" w:hAnsiTheme="majorBidi" w:cstheme="majorBidi"/>
+          <w:sz w:val="28"/>
+          <w:szCs w:val="28"/>
+          <w:lang w:bidi="fa-IR"/>
+        </w:rPr>
+        <w:t xml:space="preserve"> throws them away and keeps everything else.</w:t>
       </w:r>
     </w:p>
     <w:p>
       <w:pPr>
         <w:spacing w:after="100"/>
         <w:ind w:left="360"/>
-        <w:jc w:val="both"/>
-        <w:rPr>
-          <w:rFonts w:asciiTheme="majorBidi" w:hAnsiTheme="majorBidi" w:cstheme="majorBidi"/>
-          <w:sz w:val="28"/>
-          <w:szCs w:val="28"/>
-          <w:lang w:bidi="fa-IR"/>
-        </w:rPr>
-      </w:pPr>
-      <w:r>
-        <w:rPr>
-          <w:rFonts w:asciiTheme="majorBidi" w:hAnsiTheme="majorBidi" w:cstheme="majorBidi"/>
-          <w:sz w:val="28"/>
-          <w:szCs w:val="28"/>
-          <w:lang w:bidi="fa-IR"/>
-        </w:rPr>
-        <w:t xml:space="preserve">So </w:t>
-      </w:r>
+        <w:rPr>
+          <w:rFonts w:asciiTheme="majorBidi" w:hAnsiTheme="majorBidi" w:cstheme="majorBidi"/>
+          <w:sz w:val="28"/>
+          <w:szCs w:val="28"/>
+          <w:u w:val="single"/>
+          <w:lang w:bidi="fa-IR"/>
+        </w:rPr>
+      </w:pPr>
+      <w:r>
+        <w:rPr>
+          <w:rFonts w:asciiTheme="majorBidi" w:hAnsiTheme="majorBidi" w:cstheme="majorBidi"/>
+          <w:sz w:val="28"/>
+          <w:szCs w:val="28"/>
+          <w:u w:val="single"/>
+          <w:lang w:bidi="fa-IR"/>
+        </w:rPr>
+        <w:t>Example:</w:t>
+      </w:r>
+    </w:p>
+    <w:p>
+      <w:pPr>
+        <w:spacing w:after="100"/>
+        <w:ind w:left="360"/>
+        <w:rPr>
+          <w:rFonts w:asciiTheme="majorBidi" w:hAnsiTheme="majorBidi" w:cstheme="majorBidi"/>
+          <w:sz w:val="28"/>
+          <w:szCs w:val="28"/>
+          <w:lang w:bidi="fa-IR"/>
+        </w:rPr>
+      </w:pPr>
+      <w:r>
+        <w:rPr>
+          <w:rFonts w:asciiTheme="majorBidi" w:hAnsiTheme="majorBidi" w:cstheme="majorBidi"/>
+          <w:noProof/>
+          <w:sz w:val="28"/>
+          <w:szCs w:val="28"/>
+          <w:lang w:bidi="fa-IR"/>
+        </w:rPr>
+        <mc:AlternateContent>
+          <mc:Choice Requires="wps">
+            <w:drawing>
+              <wp:anchor distT="0" distB="0" distL="114300" distR="114300" simplePos="0" relativeHeight="251682816" behindDoc="0" locked="0" layoutInCell="1" allowOverlap="1" wp14:anchorId="45328042" wp14:editId="01EA60C6">
+                <wp:simplePos x="0" y="0"/>
+                <wp:positionH relativeFrom="margin">
+                  <wp:align>right</wp:align>
+                </wp:positionH>
+                <wp:positionV relativeFrom="paragraph">
+                  <wp:posOffset>488950</wp:posOffset>
+                </wp:positionV>
+                <wp:extent cx="6400800" cy="771525"/>
+                <wp:effectExtent l="0" t="0" r="19050" b="28575"/>
+                <wp:wrapNone/>
+                <wp:docPr id="1" name="Rectangle 1"/>
+                <wp:cNvGraphicFramePr/>
+                <a:graphic xmlns:a="http://schemas.openxmlformats.org/drawingml/2006/main">
+                  <a:graphicData uri="http://schemas.microsoft.com/office/word/2010/wordprocessingShape">
+                    <wps:wsp>
+                      <wps:cNvSpPr/>
+                      <wps:spPr>
+                        <a:xfrm>
+                          <a:off x="0" y="0"/>
+                          <a:ext cx="6400800" cy="771525"/>
+                        </a:xfrm>
+                        <a:prstGeom prst="rect">
+                          <a:avLst/>
+                        </a:prstGeom>
+                      </wps:spPr>
+                      <wps:style>
+                        <a:lnRef idx="2">
+                          <a:schemeClr val="dk1">
+                            <a:shade val="15000"/>
+                          </a:schemeClr>
+                        </a:lnRef>
+                        <a:fillRef idx="1">
+                          <a:schemeClr val="dk1"/>
+                        </a:fillRef>
+                        <a:effectRef idx="0">
+                          <a:schemeClr val="dk1"/>
+                        </a:effectRef>
+                        <a:fontRef idx="minor">
+                          <a:schemeClr val="lt1"/>
+                        </a:fontRef>
+                      </wps:style>
+                      <wps:txbx>
+                        <w:txbxContent>
+                          <w:p>
+                            <w:pPr>
+                              <w:spacing w:after="0"/>
+                              <w:rPr>
+                                <w:rFonts w:asciiTheme="majorBidi" w:hAnsiTheme="majorBidi" w:cstheme="majorBidi"/>
+                                <w:b/>
+                                <w:bCs/>
+                                <w:i/>
+                                <w:iCs/>
+                                <w:sz w:val="28"/>
+                                <w:szCs w:val="28"/>
+                                <w:lang w:bidi="fa-IR"/>
+                              </w:rPr>
+                            </w:pPr>
+                            <w:r>
+                              <w:rPr>
+                                <w:rFonts w:asciiTheme="majorBidi" w:hAnsiTheme="majorBidi" w:cstheme="majorBidi"/>
+                                <w:b/>
+                                <w:bCs/>
+                                <w:i/>
+                                <w:iCs/>
+                                <w:sz w:val="28"/>
+                                <w:szCs w:val="28"/>
+                                <w:lang w:bidi="fa-IR"/>
+                              </w:rPr>
+                              <w:t>- name: Process non-maintenance servers</w:t>
+                            </w:r>
+                          </w:p>
+                          <w:p>
+                            <w:pPr>
+                              <w:spacing w:after="0"/>
+                              <w:rPr>
+                                <w:rFonts w:asciiTheme="majorBidi" w:hAnsiTheme="majorBidi" w:cstheme="majorBidi"/>
+                                <w:b/>
+                                <w:bCs/>
+                                <w:i/>
+                                <w:iCs/>
+                                <w:sz w:val="28"/>
+                                <w:szCs w:val="28"/>
+                                <w:lang w:bidi="fa-IR"/>
+                              </w:rPr>
+                            </w:pPr>
+                            <w:r>
+                              <w:rPr>
+                                <w:rFonts w:asciiTheme="majorBidi" w:hAnsiTheme="majorBidi" w:cstheme="majorBidi"/>
+                                <w:b/>
+                                <w:bCs/>
+                                <w:i/>
+                                <w:iCs/>
+                                <w:sz w:val="28"/>
+                                <w:szCs w:val="28"/>
+                                <w:lang w:bidi="fa-IR"/>
+                              </w:rPr>
+                              <w:t xml:space="preserve">  </w:t>
+                            </w:r>
+                            <w:proofErr w:type="spellStart"/>
+                            <w:r>
+                              <w:rPr>
+                                <w:rFonts w:asciiTheme="majorBidi" w:hAnsiTheme="majorBidi" w:cstheme="majorBidi"/>
+                                <w:b/>
+                                <w:bCs/>
+                                <w:i/>
+                                <w:iCs/>
+                                <w:sz w:val="28"/>
+                                <w:szCs w:val="28"/>
+                                <w:lang w:bidi="fa-IR"/>
+                              </w:rPr>
+                              <w:t>set_fact</w:t>
+                            </w:r>
+                            <w:proofErr w:type="spellEnd"/>
+                            <w:r>
+                              <w:rPr>
+                                <w:rFonts w:asciiTheme="majorBidi" w:hAnsiTheme="majorBidi" w:cstheme="majorBidi"/>
+                                <w:b/>
+                                <w:bCs/>
+                                <w:i/>
+                                <w:iCs/>
+                                <w:sz w:val="28"/>
+                                <w:szCs w:val="28"/>
+                                <w:lang w:bidi="fa-IR"/>
+                              </w:rPr>
+                              <w:t>:</w:t>
+                            </w:r>
+                          </w:p>
+                          <w:p>
+                            <w:pPr>
+                              <w:spacing w:after="0"/>
+                              <w:rPr>
+                                <w:rFonts w:asciiTheme="majorBidi" w:hAnsiTheme="majorBidi" w:cstheme="majorBidi"/>
+                                <w:b/>
+                                <w:bCs/>
+                                <w:i/>
+                                <w:iCs/>
+                                <w:sz w:val="27"/>
+                                <w:szCs w:val="27"/>
+                                <w:lang w:bidi="fa-IR"/>
+                              </w:rPr>
+                            </w:pPr>
+                            <w:r>
+                              <w:rPr>
+                                <w:rFonts w:asciiTheme="majorBidi" w:hAnsiTheme="majorBidi" w:cstheme="majorBidi"/>
+                                <w:b/>
+                                <w:bCs/>
+                                <w:i/>
+                                <w:iCs/>
+                                <w:sz w:val="27"/>
+                                <w:szCs w:val="27"/>
+                                <w:lang w:bidi="fa-IR"/>
+                              </w:rPr>
+                              <w:t xml:space="preserve">  </w:t>
+                            </w:r>
+                            <w:r>
+                              <w:rPr>
+                                <w:rFonts w:asciiTheme="majorBidi" w:hAnsiTheme="majorBidi" w:cstheme="majorBidi"/>
+                                <w:b/>
+                                <w:bCs/>
+                                <w:i/>
+                                <w:iCs/>
+                                <w:sz w:val="27"/>
+                                <w:szCs w:val="27"/>
+                                <w:lang w:bidi="fa-IR"/>
+                              </w:rPr>
+                              <w:t xml:space="preserve">    </w:t>
+                            </w:r>
+                            <w:proofErr w:type="spellStart"/>
+                            <w:r>
+                              <w:rPr>
+                                <w:rFonts w:asciiTheme="majorBidi" w:hAnsiTheme="majorBidi" w:cstheme="majorBidi"/>
+                                <w:b/>
+                                <w:bCs/>
+                                <w:i/>
+                                <w:iCs/>
+                                <w:sz w:val="27"/>
+                                <w:szCs w:val="27"/>
+                                <w:lang w:bidi="fa-IR"/>
+                              </w:rPr>
+                              <w:t>active_servers</w:t>
+                            </w:r>
+                            <w:proofErr w:type="spellEnd"/>
+                            <w:r>
+                              <w:rPr>
+                                <w:rFonts w:asciiTheme="majorBidi" w:hAnsiTheme="majorBidi" w:cstheme="majorBidi"/>
+                                <w:b/>
+                                <w:bCs/>
+                                <w:i/>
+                                <w:iCs/>
+                                <w:sz w:val="27"/>
+                                <w:szCs w:val="27"/>
+                                <w:lang w:bidi="fa-IR"/>
+                              </w:rPr>
+                              <w:t>: "</w:t>
+                            </w:r>
+                            <w:proofErr w:type="gramStart"/>
+                            <w:r>
+                              <w:rPr>
+                                <w:rFonts w:asciiTheme="majorBidi" w:hAnsiTheme="majorBidi" w:cstheme="majorBidi"/>
+                                <w:b/>
+                                <w:bCs/>
+                                <w:i/>
+                                <w:iCs/>
+                                <w:sz w:val="27"/>
+                                <w:szCs w:val="27"/>
+                                <w:lang w:bidi="fa-IR"/>
+                              </w:rPr>
+                              <w:t xml:space="preserve">{{ </w:t>
+                            </w:r>
+                            <w:proofErr w:type="spellStart"/>
+                            <w:r>
+                              <w:rPr>
+                                <w:rFonts w:asciiTheme="majorBidi" w:hAnsiTheme="majorBidi" w:cstheme="majorBidi"/>
+                                <w:b/>
+                                <w:bCs/>
+                                <w:i/>
+                                <w:iCs/>
+                                <w:sz w:val="27"/>
+                                <w:szCs w:val="27"/>
+                                <w:lang w:bidi="fa-IR"/>
+                              </w:rPr>
+                              <w:t>all</w:t>
+                            </w:r>
+                            <w:proofErr w:type="gramEnd"/>
+                            <w:r>
+                              <w:rPr>
+                                <w:rFonts w:asciiTheme="majorBidi" w:hAnsiTheme="majorBidi" w:cstheme="majorBidi"/>
+                                <w:b/>
+                                <w:bCs/>
+                                <w:i/>
+                                <w:iCs/>
+                                <w:sz w:val="27"/>
+                                <w:szCs w:val="27"/>
+                                <w:lang w:bidi="fa-IR"/>
+                              </w:rPr>
+                              <w:t>_servers</w:t>
+                            </w:r>
+                            <w:proofErr w:type="spellEnd"/>
+                            <w:r>
+                              <w:rPr>
+                                <w:rFonts w:asciiTheme="majorBidi" w:hAnsiTheme="majorBidi" w:cstheme="majorBidi"/>
+                                <w:b/>
+                                <w:bCs/>
+                                <w:i/>
+                                <w:iCs/>
+                                <w:sz w:val="27"/>
+                                <w:szCs w:val="27"/>
+                                <w:lang w:bidi="fa-IR"/>
+                              </w:rPr>
+                              <w:t xml:space="preserve"> | </w:t>
+                            </w:r>
+                            <w:proofErr w:type="spellStart"/>
+                            <w:r>
+                              <w:rPr>
+                                <w:rFonts w:asciiTheme="majorBidi" w:hAnsiTheme="majorBidi" w:cstheme="majorBidi"/>
+                                <w:b/>
+                                <w:bCs/>
+                                <w:i/>
+                                <w:iCs/>
+                                <w:sz w:val="27"/>
+                                <w:szCs w:val="27"/>
+                                <w:lang w:bidi="fa-IR"/>
+                              </w:rPr>
+                              <w:t>rejectattr</w:t>
+                            </w:r>
+                            <w:proofErr w:type="spellEnd"/>
+                            <w:r>
+                              <w:rPr>
+                                <w:rFonts w:asciiTheme="majorBidi" w:hAnsiTheme="majorBidi" w:cstheme="majorBidi"/>
+                                <w:b/>
+                                <w:bCs/>
+                                <w:i/>
+                                <w:iCs/>
+                                <w:sz w:val="27"/>
+                                <w:szCs w:val="27"/>
+                                <w:lang w:bidi="fa-IR"/>
+                              </w:rPr>
+                              <w:t>('status', '</w:t>
+                            </w:r>
+                            <w:proofErr w:type="spellStart"/>
+                            <w:r>
+                              <w:rPr>
+                                <w:rFonts w:asciiTheme="majorBidi" w:hAnsiTheme="majorBidi" w:cstheme="majorBidi"/>
+                                <w:b/>
+                                <w:bCs/>
+                                <w:i/>
+                                <w:iCs/>
+                                <w:sz w:val="27"/>
+                                <w:szCs w:val="27"/>
+                                <w:lang w:bidi="fa-IR"/>
+                              </w:rPr>
+                              <w:t>equalto</w:t>
+                            </w:r>
+                            <w:proofErr w:type="spellEnd"/>
+                            <w:r>
+                              <w:rPr>
+                                <w:rFonts w:asciiTheme="majorBidi" w:hAnsiTheme="majorBidi" w:cstheme="majorBidi"/>
+                                <w:b/>
+                                <w:bCs/>
+                                <w:i/>
+                                <w:iCs/>
+                                <w:sz w:val="27"/>
+                                <w:szCs w:val="27"/>
+                                <w:lang w:bidi="fa-IR"/>
+                              </w:rPr>
+                              <w:t>', 'maintenance') | list }}"</w:t>
+                            </w:r>
+                          </w:p>
+                          <w:p>
+                            <w:pPr>
+                              <w:spacing w:after="0"/>
+                              <w:jc w:val="center"/>
+                              <w:rPr>
+                                <w:b/>
+                                <w:bCs/>
+                                <w:i/>
+                                <w:iCs/>
+                              </w:rPr>
+                            </w:pPr>
+                          </w:p>
+                        </w:txbxContent>
+                      </wps:txbx>
+                      <wps:bodyPr rot="0" spcFirstLastPara="0" vertOverflow="overflow" horzOverflow="overflow" vert="horz" wrap="square" lIns="91440" tIns="45720" rIns="91440" bIns="45720" numCol="1" spcCol="0" rtlCol="0" fromWordArt="0" anchor="ctr" anchorCtr="0" forceAA="0" compatLnSpc="1">
+                        <a:prstTxWarp prst="textNoShape">
+                          <a:avLst/>
+                        </a:prstTxWarp>
+                        <a:noAutofit/>
+                      </wps:bodyPr>
+                    </wps:wsp>
+                  </a:graphicData>
+                </a:graphic>
+                <wp14:sizeRelH relativeFrom="margin">
+                  <wp14:pctWidth>0</wp14:pctWidth>
+                </wp14:sizeRelH>
+                <wp14:sizeRelV relativeFrom="margin">
+                  <wp14:pctHeight>0</wp14:pctHeight>
+                </wp14:sizeRelV>
+              </wp:anchor>
+            </w:drawing>
+          </mc:Choice>
+          <mc:Fallback>
+            <w:pict>
+              <v:rect w14:anchorId="45328042" id="_x0000_s1045" style="position:absolute;left:0;text-align:left;margin-left:452.8pt;margin-top:38.5pt;width:7in;height:60.75pt;z-index:251682816;visibility:visible;mso-wrap-style:square;mso-width-percent:0;mso-height-percent:0;mso-wrap-distance-left:9pt;mso-wrap-distance-top:0;mso-wrap-distance-right:9pt;mso-wrap-distance-bottom:0;mso-position-horizontal:right;mso-position-horizontal-relative:margin;mso-position-vertical:absolute;mso-position-vertical-relative:text;mso-width-percent:0;mso-height-percent:0;mso-width-relative:margin;mso-height-relative:margin;v-text-anchor:middle" o:gfxdata="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" fillcolor="black [3200]" strokecolor="black [480]" strokeweight="1pt">
+                <v:textbox>
+                  <w:txbxContent>
+                    <w:p>
+                      <w:pPr>
+                        <w:spacing w:after="0"/>
+                        <w:rPr>
+                          <w:rFonts w:asciiTheme="majorBidi" w:hAnsiTheme="majorBidi" w:cstheme="majorBidi"/>
+                          <w:b/>
+                          <w:bCs/>
+                          <w:i/>
+                          <w:iCs/>
+                          <w:sz w:val="28"/>
+                          <w:szCs w:val="28"/>
+                          <w:lang w:bidi="fa-IR"/>
+                        </w:rPr>
+                      </w:pPr>
+                      <w:r>
+                        <w:rPr>
+                          <w:rFonts w:asciiTheme="majorBidi" w:hAnsiTheme="majorBidi" w:cstheme="majorBidi"/>
+                          <w:b/>
+                          <w:bCs/>
+                          <w:i/>
+                          <w:iCs/>
+                          <w:sz w:val="28"/>
+                          <w:szCs w:val="28"/>
+                          <w:lang w:bidi="fa-IR"/>
+                        </w:rPr>
+                        <w:t>- name: Process non-maintenance servers</w:t>
+                      </w:r>
+                    </w:p>
+                    <w:p>
+                      <w:pPr>
+                        <w:spacing w:after="0"/>
+                        <w:rPr>
+                          <w:rFonts w:asciiTheme="majorBidi" w:hAnsiTheme="majorBidi" w:cstheme="majorBidi"/>
+                          <w:b/>
+                          <w:bCs/>
+                          <w:i/>
+                          <w:iCs/>
+                          <w:sz w:val="28"/>
+                          <w:szCs w:val="28"/>
+                          <w:lang w:bidi="fa-IR"/>
+                        </w:rPr>
+                      </w:pPr>
+                      <w:r>
+                        <w:rPr>
+                          <w:rFonts w:asciiTheme="majorBidi" w:hAnsiTheme="majorBidi" w:cstheme="majorBidi"/>
+                          <w:b/>
+                          <w:bCs/>
+                          <w:i/>
+                          <w:iCs/>
+                          <w:sz w:val="28"/>
+                          <w:szCs w:val="28"/>
+                          <w:lang w:bidi="fa-IR"/>
+                        </w:rPr>
+                        <w:t xml:space="preserve">  </w:t>
+                      </w:r>
+                      <w:proofErr w:type="spellStart"/>
+                      <w:r>
+                        <w:rPr>
+                          <w:rFonts w:asciiTheme="majorBidi" w:hAnsiTheme="majorBidi" w:cstheme="majorBidi"/>
+                          <w:b/>
+                          <w:bCs/>
+                          <w:i/>
+                          <w:iCs/>
+                          <w:sz w:val="28"/>
+                          <w:szCs w:val="28"/>
+                          <w:lang w:bidi="fa-IR"/>
+                        </w:rPr>
+                        <w:t>set_fact</w:t>
+                      </w:r>
+                      <w:proofErr w:type="spellEnd"/>
+                      <w:r>
+                        <w:rPr>
+                          <w:rFonts w:asciiTheme="majorBidi" w:hAnsiTheme="majorBidi" w:cstheme="majorBidi"/>
+                          <w:b/>
+                          <w:bCs/>
+                          <w:i/>
+                          <w:iCs/>
+                          <w:sz w:val="28"/>
+                          <w:szCs w:val="28"/>
+                          <w:lang w:bidi="fa-IR"/>
+                        </w:rPr>
+                        <w:t>:</w:t>
+                      </w:r>
+                    </w:p>
+                    <w:p>
+                      <w:pPr>
+                        <w:spacing w:after="0"/>
+                        <w:rPr>
+                          <w:rFonts w:asciiTheme="majorBidi" w:hAnsiTheme="majorBidi" w:cstheme="majorBidi"/>
+                          <w:b/>
+                          <w:bCs/>
+                          <w:i/>
+                          <w:iCs/>
+                          <w:sz w:val="27"/>
+                          <w:szCs w:val="27"/>
+                          <w:lang w:bidi="fa-IR"/>
+                        </w:rPr>
+                      </w:pPr>
+                      <w:r>
+                        <w:rPr>
+                          <w:rFonts w:asciiTheme="majorBidi" w:hAnsiTheme="majorBidi" w:cstheme="majorBidi"/>
+                          <w:b/>
+                          <w:bCs/>
+                          <w:i/>
+                          <w:iCs/>
+                          <w:sz w:val="27"/>
+                          <w:szCs w:val="27"/>
+                          <w:lang w:bidi="fa-IR"/>
+                        </w:rPr>
+                        <w:t xml:space="preserve">  </w:t>
+                      </w:r>
+                      <w:r>
+                        <w:rPr>
+                          <w:rFonts w:asciiTheme="majorBidi" w:hAnsiTheme="majorBidi" w:cstheme="majorBidi"/>
+                          <w:b/>
+                          <w:bCs/>
+                          <w:i/>
+                          <w:iCs/>
+                          <w:sz w:val="27"/>
+                          <w:szCs w:val="27"/>
+                          <w:lang w:bidi="fa-IR"/>
+                        </w:rPr>
+                        <w:t xml:space="preserve">    </w:t>
+                      </w:r>
+                      <w:proofErr w:type="spellStart"/>
+                      <w:r>
+                        <w:rPr>
+                          <w:rFonts w:asciiTheme="majorBidi" w:hAnsiTheme="majorBidi" w:cstheme="majorBidi"/>
+                          <w:b/>
+                          <w:bCs/>
+                          <w:i/>
+                          <w:iCs/>
+                          <w:sz w:val="27"/>
+                          <w:szCs w:val="27"/>
+                          <w:lang w:bidi="fa-IR"/>
+                        </w:rPr>
+                        <w:t>active_servers</w:t>
+                      </w:r>
+                      <w:proofErr w:type="spellEnd"/>
+                      <w:r>
+                        <w:rPr>
+                          <w:rFonts w:asciiTheme="majorBidi" w:hAnsiTheme="majorBidi" w:cstheme="majorBidi"/>
+                          <w:b/>
+                          <w:bCs/>
+                          <w:i/>
+                          <w:iCs/>
+                          <w:sz w:val="27"/>
+                          <w:szCs w:val="27"/>
+                          <w:lang w:bidi="fa-IR"/>
+                        </w:rPr>
+                        <w:t>: "</w:t>
+                      </w:r>
+                      <w:proofErr w:type="gramStart"/>
+                      <w:r>
+                        <w:rPr>
+                          <w:rFonts w:asciiTheme="majorBidi" w:hAnsiTheme="majorBidi" w:cstheme="majorBidi"/>
+                          <w:b/>
+                          <w:bCs/>
+                          <w:i/>
+                          <w:iCs/>
+                          <w:sz w:val="27"/>
+                          <w:szCs w:val="27"/>
+                          <w:lang w:bidi="fa-IR"/>
+                        </w:rPr>
+                        <w:t xml:space="preserve">{{ </w:t>
+                      </w:r>
+                      <w:proofErr w:type="spellStart"/>
+                      <w:r>
+                        <w:rPr>
+                          <w:rFonts w:asciiTheme="majorBidi" w:hAnsiTheme="majorBidi" w:cstheme="majorBidi"/>
+                          <w:b/>
+                          <w:bCs/>
+                          <w:i/>
+                          <w:iCs/>
+                          <w:sz w:val="27"/>
+                          <w:szCs w:val="27"/>
+                          <w:lang w:bidi="fa-IR"/>
+                        </w:rPr>
+                        <w:t>all</w:t>
+                      </w:r>
+                      <w:proofErr w:type="gramEnd"/>
+                      <w:r>
+                        <w:rPr>
+                          <w:rFonts w:asciiTheme="majorBidi" w:hAnsiTheme="majorBidi" w:cstheme="majorBidi"/>
+                          <w:b/>
+                          <w:bCs/>
+                          <w:i/>
+                          <w:iCs/>
+                          <w:sz w:val="27"/>
+                          <w:szCs w:val="27"/>
+                          <w:lang w:bidi="fa-IR"/>
+                        </w:rPr>
+                        <w:t>_servers</w:t>
+                      </w:r>
+                      <w:proofErr w:type="spellEnd"/>
+                      <w:r>
+                        <w:rPr>
+                          <w:rFonts w:asciiTheme="majorBidi" w:hAnsiTheme="majorBidi" w:cstheme="majorBidi"/>
+                          <w:b/>
+                          <w:bCs/>
+                          <w:i/>
+                          <w:iCs/>
+                          <w:sz w:val="27"/>
+                          <w:szCs w:val="27"/>
+                          <w:lang w:bidi="fa-IR"/>
+                        </w:rPr>
+                        <w:t xml:space="preserve"> | </w:t>
+                      </w:r>
+                      <w:proofErr w:type="spellStart"/>
+                      <w:r>
+                        <w:rPr>
+                          <w:rFonts w:asciiTheme="majorBidi" w:hAnsiTheme="majorBidi" w:cstheme="majorBidi"/>
+                          <w:b/>
+                          <w:bCs/>
+                          <w:i/>
+                          <w:iCs/>
+                          <w:sz w:val="27"/>
+                          <w:szCs w:val="27"/>
+                          <w:lang w:bidi="fa-IR"/>
+                        </w:rPr>
+                        <w:t>rejectattr</w:t>
+                      </w:r>
+                      <w:proofErr w:type="spellEnd"/>
+                      <w:r>
+                        <w:rPr>
+                          <w:rFonts w:asciiTheme="majorBidi" w:hAnsiTheme="majorBidi" w:cstheme="majorBidi"/>
+                          <w:b/>
+                          <w:bCs/>
+                          <w:i/>
+                          <w:iCs/>
+                          <w:sz w:val="27"/>
+                          <w:szCs w:val="27"/>
+                          <w:lang w:bidi="fa-IR"/>
+                        </w:rPr>
+                        <w:t>('status', '</w:t>
+                      </w:r>
+                      <w:proofErr w:type="spellStart"/>
+                      <w:r>
+                        <w:rPr>
+                          <w:rFonts w:asciiTheme="majorBidi" w:hAnsiTheme="majorBidi" w:cstheme="majorBidi"/>
+                          <w:b/>
+                          <w:bCs/>
+                          <w:i/>
+                          <w:iCs/>
+                          <w:sz w:val="27"/>
+                          <w:szCs w:val="27"/>
+                          <w:lang w:bidi="fa-IR"/>
+                        </w:rPr>
+                        <w:t>equalto</w:t>
+                      </w:r>
+                      <w:proofErr w:type="spellEnd"/>
+                      <w:r>
+                        <w:rPr>
+                          <w:rFonts w:asciiTheme="majorBidi" w:hAnsiTheme="majorBidi" w:cstheme="majorBidi"/>
+                          <w:b/>
+                          <w:bCs/>
+                          <w:i/>
+                          <w:iCs/>
+                          <w:sz w:val="27"/>
+                          <w:szCs w:val="27"/>
+                          <w:lang w:bidi="fa-IR"/>
+                        </w:rPr>
+                        <w:t>', 'maintenance') | list }}"</w:t>
+                      </w:r>
+                    </w:p>
+                    <w:p>
+                      <w:pPr>
+                        <w:spacing w:after="0"/>
+                        <w:jc w:val="center"/>
+                        <w:rPr>
+                          <w:b/>
+                          <w:bCs/>
+                          <w:i/>
+                          <w:iCs/>
+                        </w:rPr>
+                      </w:pPr>
+                    </w:p>
+                  </w:txbxContent>
+                </v:textbox>
+                <w10:wrap anchorx="margin"/>
+              </v:rect>
+            </w:pict>
+          </mc:Fallback>
+        </mc:AlternateContent>
+      </w:r>
+      <w:r>
+        <w:rPr>
+          <w:rFonts w:asciiTheme="majorBidi" w:hAnsiTheme="majorBidi" w:cstheme="majorBidi"/>
+          <w:sz w:val="28"/>
+          <w:szCs w:val="28"/>
+          <w:lang w:bidi="fa-IR"/>
+        </w:rPr>
+        <w:t>If you have a list of servers and want to work on everything except those in maintenance mode:</w:t>
+      </w:r>
+    </w:p>
+    <w:p>
+      <w:pPr>
+        <w:spacing w:after="100"/>
+        <w:rPr>
+          <w:rFonts w:asciiTheme="majorBidi" w:hAnsiTheme="majorBidi" w:cstheme="majorBidi"/>
+          <w:sz w:val="28"/>
+          <w:szCs w:val="28"/>
+          <w:lang w:bidi="fa-IR"/>
+        </w:rPr>
+      </w:pPr>
+    </w:p>
+    <w:p>
+      <w:pPr>
+        <w:spacing w:after="100"/>
+        <w:rPr>
+          <w:rFonts w:asciiTheme="majorBidi" w:hAnsiTheme="majorBidi" w:cstheme="majorBidi"/>
+          <w:sz w:val="28"/>
+          <w:szCs w:val="28"/>
+          <w:lang w:bidi="fa-IR"/>
+        </w:rPr>
+      </w:pPr>
+    </w:p>
+    <w:p>
+      <w:pPr>
+        <w:spacing w:after="100"/>
+        <w:rPr>
+          <w:rFonts w:asciiTheme="majorBidi" w:hAnsiTheme="majorBidi" w:cstheme="majorBidi"/>
+          <w:sz w:val="28"/>
+          <w:szCs w:val="28"/>
+          <w:lang w:bidi="fa-IR"/>
+        </w:rPr>
+      </w:pPr>
+    </w:p>
+    <w:p>
+      <w:pPr>
+        <w:spacing w:after="100"/>
+        <w:ind w:left="360"/>
+        <w:rPr>
+          <w:rFonts w:asciiTheme="majorBidi" w:hAnsiTheme="majorBidi" w:cstheme="majorBidi"/>
+          <w:b/>
+          <w:bCs/>
+          <w:sz w:val="28"/>
+          <w:szCs w:val="28"/>
+          <w:lang w:bidi="fa-IR"/>
+        </w:rPr>
+      </w:pPr>
+      <w:r>
+        <w:rPr>
+          <w:rFonts w:asciiTheme="majorBidi" w:hAnsiTheme="majorBidi" w:cstheme="majorBidi"/>
+          <w:b/>
+          <w:bCs/>
+          <w:sz w:val="28"/>
+          <w:szCs w:val="28"/>
+          <w:lang w:bidi="fa-IR"/>
+        </w:rPr>
+        <w:t>Key Difference:</w:t>
+      </w:r>
+    </w:p>
+    <w:p>
+      <w:pPr>
+        <w:pStyle w:val="ListParagraph"/>
+        <w:numPr>
+          <w:ilvl w:val="0"/>
+          <w:numId w:val="22"/>
+        </w:numPr>
+        <w:spacing w:after="100"/>
+        <w:ind w:left="720"/>
+        <w:rPr>
+          <w:rFonts w:asciiTheme="majorBidi" w:hAnsiTheme="majorBidi" w:cstheme="majorBidi"/>
+          <w:sz w:val="28"/>
+          <w:szCs w:val="28"/>
+          <w:lang w:bidi="fa-IR"/>
+        </w:rPr>
+      </w:pPr>
       <w:proofErr w:type="spellStart"/>
       <w:r>
         <w:rPr>
@@ -18650,6 +18860,33 @@
       <w:r>
         <w:rPr>
           <w:rFonts w:asciiTheme="majorBidi" w:hAnsiTheme="majorBidi" w:cstheme="majorBidi"/>
+          <w:sz w:val="28"/>
+          <w:szCs w:val="28"/>
+          <w:lang w:bidi="fa-IR"/>
+        </w:rPr>
+        <w:t xml:space="preserve"> → “Give me only the ones that match X.”</w:t>
+      </w:r>
+    </w:p>
+    <w:p>
+      <w:pPr>
+        <w:pStyle w:val="ListParagraph"/>
+        <w:numPr>
+          <w:ilvl w:val="0"/>
+          <w:numId w:val="22"/>
+        </w:numPr>
+        <w:spacing w:after="100"/>
+        <w:ind w:left="720"/>
+        <w:rPr>
+          <w:rFonts w:asciiTheme="majorBidi" w:hAnsiTheme="majorBidi" w:cstheme="majorBidi"/>
+          <w:sz w:val="28"/>
+          <w:szCs w:val="28"/>
+          <w:lang w:bidi="fa-IR"/>
+        </w:rPr>
+      </w:pPr>
+      <w:proofErr w:type="spellStart"/>
+      <w:r>
+        <w:rPr>
+          <w:rFonts w:asciiTheme="majorBidi" w:hAnsiTheme="majorBidi" w:cstheme="majorBidi"/>
           <w:b/>
           <w:bCs/>
           <w:i/>
@@ -18658,16 +18895,38 @@
           <w:szCs w:val="28"/>
           <w:lang w:bidi="fa-IR"/>
         </w:rPr>
-        <w:t xml:space="preserve"> =</w:t>
-      </w:r>
-      <w:r>
-        <w:rPr>
-          <w:rFonts w:asciiTheme="majorBidi" w:hAnsiTheme="majorBidi" w:cstheme="majorBidi"/>
-          <w:sz w:val="28"/>
-          <w:szCs w:val="28"/>
-          <w:lang w:bidi="fa-IR"/>
-        </w:rPr>
-        <w:t xml:space="preserve"> “filter this list to only items whose attribute matches a condition.”</w:t>
+        <w:t>rejectattr</w:t>
+      </w:r>
+      <w:proofErr w:type="spellEnd"/>
+      <w:r>
+        <w:rPr>
+          <w:rFonts w:asciiTheme="majorBidi" w:hAnsiTheme="majorBidi" w:cstheme="majorBidi"/>
+          <w:sz w:val="28"/>
+          <w:szCs w:val="28"/>
+          <w:lang w:bidi="fa-IR"/>
+        </w:rPr>
+        <w:t xml:space="preserve"> → “Give me everything except the ones that match X.”</w:t>
+      </w:r>
+    </w:p>
+    <w:p>
+      <w:pPr>
+        <w:spacing w:after="100"/>
+        <w:ind w:left="360"/>
+        <w:rPr>
+          <w:rFonts w:asciiTheme="majorBidi" w:hAnsiTheme="majorBidi" w:cstheme="majorBidi"/>
+          <w:sz w:val="28"/>
+          <w:szCs w:val="28"/>
+          <w:lang w:bidi="fa-IR"/>
+        </w:rPr>
+      </w:pPr>
+      <w:r>
+        <w:rPr>
+          <w:rFonts w:asciiTheme="majorBidi" w:hAnsiTheme="majorBidi" w:cstheme="majorBidi"/>
+          <w:sz w:val="28"/>
+          <w:szCs w:val="28"/>
+          <w:lang w:bidi="fa-IR"/>
+        </w:rPr>
+        <w:t>It is the cleanest way to perform “exclusion” filtering on lists without writing messy when conditions.</w:t>
       </w:r>
     </w:p>
     <w:p>
@@ -18823,9 +19082,9 @@
           <w:szCs w:val="28"/>
           <w:lang w:bidi="fa-IR"/>
         </w:rPr>
-        <w:t>to_</w:t>
-      </w:r>
-      <w:proofErr w:type="gramStart"/>
+        <w:t>to_json</w:t>
+      </w:r>
+      <w:proofErr w:type="spellEnd"/>
       <w:r>
         <w:rPr>
           <w:rFonts w:asciiTheme="majorBidi" w:hAnsiTheme="majorBidi" w:cstheme="majorBidi"/>
@@ -18837,35 +19096,7 @@
           <w:szCs w:val="28"/>
           <w:lang w:bidi="fa-IR"/>
         </w:rPr>
-        <w:t>json</w:t>
-      </w:r>
-      <w:proofErr w:type="spellEnd"/>
-      <w:r>
-        <w:rPr>
-          <w:rFonts w:asciiTheme="majorBidi" w:hAnsiTheme="majorBidi" w:cstheme="majorBidi"/>
-          <w:b/>
-          <w:bCs/>
-          <w:i/>
-          <w:iCs/>
-          <w:sz w:val="28"/>
-          <w:szCs w:val="28"/>
-          <w:lang w:bidi="fa-IR"/>
-        </w:rPr>
-        <w:t xml:space="preserve"> }</w:t>
-      </w:r>
-      <w:proofErr w:type="gramEnd"/>
-      <w:r>
-        <w:rPr>
-          <w:rFonts w:asciiTheme="majorBidi" w:hAnsiTheme="majorBidi" w:cstheme="majorBidi"/>
-          <w:b/>
-          <w:bCs/>
-          <w:i/>
-          <w:iCs/>
-          <w:sz w:val="28"/>
-          <w:szCs w:val="28"/>
-          <w:lang w:bidi="fa-IR"/>
-        </w:rPr>
-        <w:t>}</w:t>
+        <w:t xml:space="preserve"> }}</w:t>
       </w:r>
     </w:p>
     <w:p>
@@ -19374,7 +19605,6 @@
           <w:szCs w:val="40"/>
           <w:lang w:bidi="fa-IR"/>
         </w:rPr>
-        <w:lastRenderedPageBreak/>
         <w:t>Variable Precedence</w:t>
       </w:r>
     </w:p>
@@ -20058,23 +20288,8 @@
           <w:szCs w:val="28"/>
           <w:lang w:bidi="fa-IR"/>
         </w:rPr>
-        <w:t xml:space="preserve">: </w:t>
-      </w:r>
-      <w:proofErr w:type="gramStart"/>
-      <w:r>
-        <w:rPr>
-          <w:rFonts w:asciiTheme="majorBidi" w:hAnsiTheme="majorBidi" w:cstheme="majorBidi"/>
-          <w:b/>
-          <w:bCs/>
-          <w:i/>
-          <w:iCs/>
-          <w:sz w:val="28"/>
-          <w:szCs w:val="28"/>
-          <w:lang w:bidi="fa-IR"/>
-        </w:rPr>
-        <w:t>8080 }</w:t>
-      </w:r>
-      <w:proofErr w:type="gramEnd"/>
+        <w:t>: 8080 }</w:t>
+      </w:r>
     </w:p>
     <w:p>
       <w:pPr>
@@ -20280,6 +20495,7 @@
           <w:szCs w:val="36"/>
           <w:lang w:bidi="fa-IR"/>
         </w:rPr>
+        <w:lastRenderedPageBreak/>
         <w:t>Detailed Breakdown of Key Levels</w:t>
       </w:r>
       <w:r>
@@ -20799,7 +21015,6 @@
           <w:szCs w:val="28"/>
           <w:lang w:bidi="fa-IR"/>
         </w:rPr>
-        <w:lastRenderedPageBreak/>
         <w:t>set_fact</w:t>
       </w:r>
       <w:proofErr w:type="spellEnd"/>
@@ -21072,10 +21287,13 @@
           <w:szCs w:val="28"/>
           <w:lang w:bidi="fa-IR"/>
         </w:rPr>
-        <w:t xml:space="preserve">: 80, debug: </w:t>
-      </w:r>
-      <w:proofErr w:type="gramStart"/>
-      <w:r>
+        <w:t>: 80, debug: false }</w:t>
+      </w:r>
+    </w:p>
+    <w:p>
+      <w:pPr>
+        <w:spacing w:after="60"/>
+        <w:jc w:val="both"/>
         <w:rPr>
           <w:rFonts w:asciiTheme="majorBidi" w:hAnsiTheme="majorBidi" w:cstheme="majorBidi"/>
           <w:b/>
@@ -21086,14 +21304,9 @@
           <w:szCs w:val="28"/>
           <w:lang w:bidi="fa-IR"/>
         </w:rPr>
-        <w:t>false }</w:t>
-      </w:r>
-      <w:proofErr w:type="gramEnd"/>
-    </w:p>
-    <w:p>
-      <w:pPr>
-        <w:spacing w:after="60"/>
-        <w:jc w:val="both"/>
+      </w:pPr>
+      <w:proofErr w:type="spellStart"/>
+      <w:r>
         <w:rPr>
           <w:rFonts w:asciiTheme="majorBidi" w:hAnsiTheme="majorBidi" w:cstheme="majorBidi"/>
           <w:b/>
@@ -21104,8 +21317,9 @@
           <w:szCs w:val="28"/>
           <w:lang w:bidi="fa-IR"/>
         </w:rPr>
-      </w:pPr>
-      <w:proofErr w:type="spellStart"/>
+        <w:t>playbook.yml</w:t>
+      </w:r>
+      <w:proofErr w:type="spellEnd"/>
       <w:r>
         <w:rPr>
           <w:rFonts w:asciiTheme="majorBidi" w:hAnsiTheme="majorBidi" w:cstheme="majorBidi"/>
@@ -21117,9 +21331,8 @@
           <w:szCs w:val="28"/>
           <w:lang w:bidi="fa-IR"/>
         </w:rPr>
-        <w:t>playbook.yml</w:t>
-      </w:r>
-      <w:proofErr w:type="spellEnd"/>
+        <w:t>: vars</w:t>
+      </w:r>
       <w:r>
         <w:rPr>
           <w:rFonts w:asciiTheme="majorBidi" w:hAnsiTheme="majorBidi" w:cstheme="majorBidi"/>
@@ -21131,7 +21344,16 @@
           <w:szCs w:val="28"/>
           <w:lang w:bidi="fa-IR"/>
         </w:rPr>
-        <w:t>: vars</w:t>
+        <w:t xml:space="preserve"> </w:t>
+      </w:r>
+      <w:r>
+        <w:rPr>
+          <w:rFonts w:asciiTheme="majorBidi" w:hAnsiTheme="majorBidi" w:cstheme="majorBidi"/>
+          <w:sz w:val="28"/>
+          <w:szCs w:val="28"/>
+          <w:lang w:bidi="fa-IR"/>
+        </w:rPr>
+        <w:t>→</w:t>
       </w:r>
       <w:r>
         <w:rPr>
@@ -21144,17 +21366,9 @@
           <w:szCs w:val="28"/>
           <w:lang w:bidi="fa-IR"/>
         </w:rPr>
-        <w:t xml:space="preserve"> </w:t>
-      </w:r>
-      <w:r>
-        <w:rPr>
-          <w:rFonts w:asciiTheme="majorBidi" w:hAnsiTheme="majorBidi" w:cstheme="majorBidi"/>
-          <w:sz w:val="28"/>
-          <w:szCs w:val="28"/>
-          <w:lang w:bidi="fa-IR"/>
-        </w:rPr>
-        <w:t>→</w:t>
-      </w:r>
+        <w:t xml:space="preserve"> config: </w:t>
+      </w:r>
+      <w:proofErr w:type="gramStart"/>
       <w:r>
         <w:rPr>
           <w:rFonts w:asciiTheme="majorBidi" w:hAnsiTheme="majorBidi" w:cstheme="majorBidi"/>
@@ -21166,9 +21380,9 @@
           <w:szCs w:val="28"/>
           <w:lang w:bidi="fa-IR"/>
         </w:rPr>
-        <w:t xml:space="preserve"> config: </w:t>
-      </w:r>
-      <w:proofErr w:type="gramStart"/>
+        <w:t>{ debug</w:t>
+      </w:r>
+      <w:proofErr w:type="gramEnd"/>
       <w:r>
         <w:rPr>
           <w:rFonts w:asciiTheme="majorBidi" w:hAnsiTheme="majorBidi" w:cstheme="majorBidi"/>
@@ -21180,10 +21394,34 @@
           <w:szCs w:val="28"/>
           <w:lang w:bidi="fa-IR"/>
         </w:rPr>
-        <w:t>{ debug</w:t>
-      </w:r>
-      <w:proofErr w:type="gramEnd"/>
-      <w:r>
+        <w:t>: true }</w:t>
+      </w:r>
+    </w:p>
+    <w:p>
+      <w:pPr>
+        <w:spacing w:after="60"/>
+        <w:jc w:val="both"/>
+        <w:rPr>
+          <w:rFonts w:asciiTheme="majorBidi" w:hAnsiTheme="majorBidi" w:cstheme="majorBidi"/>
+          <w:sz w:val="28"/>
+          <w:szCs w:val="28"/>
+          <w:lang w:bidi="fa-IR"/>
+        </w:rPr>
+      </w:pPr>
+      <w:r>
+        <w:rPr>
+          <w:rFonts w:asciiTheme="majorBidi" w:hAnsiTheme="majorBidi" w:cstheme="majorBidi"/>
+          <w:sz w:val="28"/>
+          <w:szCs w:val="28"/>
+          <w:lang w:bidi="fa-IR"/>
+        </w:rPr>
+        <w:t>By default, Ansible will merge these into:</w:t>
+      </w:r>
+    </w:p>
+    <w:p>
+      <w:pPr>
+        <w:spacing w:after="80"/>
+        <w:jc w:val="both"/>
         <w:rPr>
           <w:rFonts w:asciiTheme="majorBidi" w:hAnsiTheme="majorBidi" w:cstheme="majorBidi"/>
           <w:b/>
@@ -21194,8 +21432,7 @@
           <w:szCs w:val="28"/>
           <w:lang w:bidi="fa-IR"/>
         </w:rPr>
-        <w:t xml:space="preserve">: </w:t>
-      </w:r>
+      </w:pPr>
       <w:proofErr w:type="gramStart"/>
       <w:r>
         <w:rPr>
@@ -21208,35 +21445,10 @@
           <w:szCs w:val="28"/>
           <w:lang w:bidi="fa-IR"/>
         </w:rPr>
-        <w:t>true }</w:t>
+        <w:t>{ port</w:t>
       </w:r>
       <w:proofErr w:type="gramEnd"/>
-    </w:p>
-    <w:p>
-      <w:pPr>
-        <w:spacing w:after="60"/>
-        <w:jc w:val="both"/>
-        <w:rPr>
-          <w:rFonts w:asciiTheme="majorBidi" w:hAnsiTheme="majorBidi" w:cstheme="majorBidi"/>
-          <w:sz w:val="28"/>
-          <w:szCs w:val="28"/>
-          <w:lang w:bidi="fa-IR"/>
-        </w:rPr>
-      </w:pPr>
-      <w:r>
-        <w:rPr>
-          <w:rFonts w:asciiTheme="majorBidi" w:hAnsiTheme="majorBidi" w:cstheme="majorBidi"/>
-          <w:sz w:val="28"/>
-          <w:szCs w:val="28"/>
-          <w:lang w:bidi="fa-IR"/>
-        </w:rPr>
-        <w:t>By default, Ansible will merge these into:</w:t>
-      </w:r>
-    </w:p>
-    <w:p>
-      <w:pPr>
-        <w:spacing w:after="80"/>
-        <w:jc w:val="both"/>
+      <w:r>
         <w:rPr>
           <w:rFonts w:asciiTheme="majorBidi" w:hAnsiTheme="majorBidi" w:cstheme="majorBidi"/>
           <w:b/>
@@ -21247,8 +21459,40 @@
           <w:szCs w:val="28"/>
           <w:lang w:bidi="fa-IR"/>
         </w:rPr>
-      </w:pPr>
-      <w:proofErr w:type="gramStart"/>
+        <w:t>: 80, debug: true }</w:t>
+      </w:r>
+    </w:p>
+    <w:p>
+      <w:pPr>
+        <w:jc w:val="both"/>
+        <w:rPr>
+          <w:rFonts w:asciiTheme="majorBidi" w:hAnsiTheme="majorBidi" w:cstheme="majorBidi"/>
+          <w:sz w:val="28"/>
+          <w:szCs w:val="28"/>
+          <w:lang w:bidi="fa-IR"/>
+        </w:rPr>
+      </w:pPr>
+      <w:r>
+        <w:rPr>
+          <w:rFonts w:asciiTheme="majorBidi" w:hAnsiTheme="majorBidi" w:cstheme="majorBidi"/>
+          <w:b/>
+          <w:bCs/>
+          <w:sz w:val="28"/>
+          <w:szCs w:val="28"/>
+          <w:lang w:bidi="fa-IR"/>
+        </w:rPr>
+        <w:t>Note:</w:t>
+      </w:r>
+      <w:r>
+        <w:rPr>
+          <w:rFonts w:asciiTheme="majorBidi" w:hAnsiTheme="majorBidi" w:cstheme="majorBidi"/>
+          <w:sz w:val="28"/>
+          <w:szCs w:val="28"/>
+          <w:lang w:bidi="fa-IR"/>
+        </w:rPr>
+        <w:t xml:space="preserve"> You can control this behavior with the </w:t>
+      </w:r>
+      <w:proofErr w:type="spellStart"/>
       <w:r>
         <w:rPr>
           <w:rFonts w:asciiTheme="majorBidi" w:hAnsiTheme="majorBidi" w:cstheme="majorBidi"/>
@@ -21260,9 +21504,9 @@
           <w:szCs w:val="28"/>
           <w:lang w:bidi="fa-IR"/>
         </w:rPr>
-        <w:t>{ port</w:t>
-      </w:r>
-      <w:proofErr w:type="gramEnd"/>
+        <w:t>hash_behaviour</w:t>
+      </w:r>
+      <w:proofErr w:type="spellEnd"/>
       <w:r>
         <w:rPr>
           <w:rFonts w:asciiTheme="majorBidi" w:hAnsiTheme="majorBidi" w:cstheme="majorBidi"/>
@@ -21274,9 +21518,18 @@
           <w:szCs w:val="28"/>
           <w:lang w:bidi="fa-IR"/>
         </w:rPr>
-        <w:t xml:space="preserve">: 80, debug: </w:t>
-      </w:r>
-      <w:proofErr w:type="gramStart"/>
+        <w:t xml:space="preserve"> </w:t>
+      </w:r>
+      <w:r>
+        <w:rPr>
+          <w:rFonts w:asciiTheme="majorBidi" w:hAnsiTheme="majorBidi" w:cstheme="majorBidi"/>
+          <w:sz w:val="28"/>
+          <w:szCs w:val="28"/>
+          <w:lang w:bidi="fa-IR"/>
+        </w:rPr>
+        <w:t xml:space="preserve">setting in </w:t>
+      </w:r>
+      <w:proofErr w:type="spellStart"/>
       <w:r>
         <w:rPr>
           <w:rFonts w:asciiTheme="majorBidi" w:hAnsiTheme="majorBidi" w:cstheme="majorBidi"/>
@@ -21288,89 +21541,6 @@
           <w:szCs w:val="28"/>
           <w:lang w:bidi="fa-IR"/>
         </w:rPr>
-        <w:t>true }</w:t>
-      </w:r>
-      <w:proofErr w:type="gramEnd"/>
-    </w:p>
-    <w:p>
-      <w:pPr>
-        <w:jc w:val="both"/>
-        <w:rPr>
-          <w:rFonts w:asciiTheme="majorBidi" w:hAnsiTheme="majorBidi" w:cstheme="majorBidi"/>
-          <w:sz w:val="28"/>
-          <w:szCs w:val="28"/>
-          <w:lang w:bidi="fa-IR"/>
-        </w:rPr>
-      </w:pPr>
-      <w:r>
-        <w:rPr>
-          <w:rFonts w:asciiTheme="majorBidi" w:hAnsiTheme="majorBidi" w:cstheme="majorBidi"/>
-          <w:b/>
-          <w:bCs/>
-          <w:sz w:val="28"/>
-          <w:szCs w:val="28"/>
-          <w:lang w:bidi="fa-IR"/>
-        </w:rPr>
-        <w:t>Note:</w:t>
-      </w:r>
-      <w:r>
-        <w:rPr>
-          <w:rFonts w:asciiTheme="majorBidi" w:hAnsiTheme="majorBidi" w:cstheme="majorBidi"/>
-          <w:sz w:val="28"/>
-          <w:szCs w:val="28"/>
-          <w:lang w:bidi="fa-IR"/>
-        </w:rPr>
-        <w:t xml:space="preserve"> You can control this behavior with the </w:t>
-      </w:r>
-      <w:proofErr w:type="spellStart"/>
-      <w:r>
-        <w:rPr>
-          <w:rFonts w:asciiTheme="majorBidi" w:hAnsiTheme="majorBidi" w:cstheme="majorBidi"/>
-          <w:b/>
-          <w:bCs/>
-          <w:i/>
-          <w:iCs/>
-          <w:sz w:val="28"/>
-          <w:szCs w:val="28"/>
-          <w:lang w:bidi="fa-IR"/>
-        </w:rPr>
-        <w:t>hash_behaviour</w:t>
-      </w:r>
-      <w:proofErr w:type="spellEnd"/>
-      <w:r>
-        <w:rPr>
-          <w:rFonts w:asciiTheme="majorBidi" w:hAnsiTheme="majorBidi" w:cstheme="majorBidi"/>
-          <w:b/>
-          <w:bCs/>
-          <w:i/>
-          <w:iCs/>
-          <w:sz w:val="28"/>
-          <w:szCs w:val="28"/>
-          <w:lang w:bidi="fa-IR"/>
-        </w:rPr>
-        <w:t xml:space="preserve"> </w:t>
-      </w:r>
-      <w:r>
-        <w:rPr>
-          <w:rFonts w:asciiTheme="majorBidi" w:hAnsiTheme="majorBidi" w:cstheme="majorBidi"/>
-          <w:sz w:val="28"/>
-          <w:szCs w:val="28"/>
-          <w:lang w:bidi="fa-IR"/>
-        </w:rPr>
-        <w:t xml:space="preserve">setting in </w:t>
-      </w:r>
-      <w:proofErr w:type="spellStart"/>
-      <w:r>
-        <w:rPr>
-          <w:rFonts w:asciiTheme="majorBidi" w:hAnsiTheme="majorBidi" w:cstheme="majorBidi"/>
-          <w:b/>
-          <w:bCs/>
-          <w:i/>
-          <w:iCs/>
-          <w:sz w:val="28"/>
-          <w:szCs w:val="28"/>
-          <w:lang w:bidi="fa-IR"/>
-        </w:rPr>
         <w:t>ansible.cfg</w:t>
       </w:r>
       <w:proofErr w:type="spellEnd"/>
@@ -21593,7 +21763,6 @@
           <w:szCs w:val="40"/>
           <w:lang w:bidi="fa-IR"/>
         </w:rPr>
-        <w:lastRenderedPageBreak/>
         <w:t>Magic Variables</w:t>
       </w:r>
       <w:r>
@@ -21905,91 +22074,7 @@
           <w:szCs w:val="28"/>
           <w:lang w:bidi="fa-IR"/>
         </w:rPr>
-        <w:t>['web02</w:t>
-      </w:r>
-      <w:proofErr w:type="gramStart"/>
-      <w:r>
-        <w:rPr>
-          <w:rFonts w:asciiTheme="majorBidi" w:hAnsiTheme="majorBidi" w:cstheme="majorBidi"/>
-          <w:b/>
-          <w:bCs/>
-          <w:i/>
-          <w:iCs/>
-          <w:sz w:val="28"/>
-          <w:szCs w:val="28"/>
-          <w:lang w:bidi="fa-IR"/>
-        </w:rPr>
-        <w:t>'][</w:t>
-      </w:r>
-      <w:proofErr w:type="gramEnd"/>
-      <w:r>
-        <w:rPr>
-          <w:rFonts w:asciiTheme="majorBidi" w:hAnsiTheme="majorBidi" w:cstheme="majorBidi"/>
-          <w:b/>
-          <w:bCs/>
-          <w:i/>
-          <w:iCs/>
-          <w:sz w:val="28"/>
-          <w:szCs w:val="28"/>
-          <w:lang w:bidi="fa-IR"/>
-        </w:rPr>
-        <w:t>'ansible_default_ipv4</w:t>
-      </w:r>
-      <w:proofErr w:type="gramStart"/>
-      <w:r>
-        <w:rPr>
-          <w:rFonts w:asciiTheme="majorBidi" w:hAnsiTheme="majorBidi" w:cstheme="majorBidi"/>
-          <w:b/>
-          <w:bCs/>
-          <w:i/>
-          <w:iCs/>
-          <w:sz w:val="28"/>
-          <w:szCs w:val="28"/>
-          <w:lang w:bidi="fa-IR"/>
-        </w:rPr>
-        <w:t>'][</w:t>
-      </w:r>
-      <w:proofErr w:type="gramEnd"/>
-      <w:r>
-        <w:rPr>
-          <w:rFonts w:asciiTheme="majorBidi" w:hAnsiTheme="majorBidi" w:cstheme="majorBidi"/>
-          <w:b/>
-          <w:bCs/>
-          <w:i/>
-          <w:iCs/>
-          <w:sz w:val="28"/>
-          <w:szCs w:val="28"/>
-          <w:lang w:bidi="fa-IR"/>
-        </w:rPr>
-        <w:t>'address'</w:t>
-      </w:r>
-      <w:proofErr w:type="gramStart"/>
-      <w:r>
-        <w:rPr>
-          <w:rFonts w:asciiTheme="majorBidi" w:hAnsiTheme="majorBidi" w:cstheme="majorBidi"/>
-          <w:b/>
-          <w:bCs/>
-          <w:i/>
-          <w:iCs/>
-          <w:sz w:val="28"/>
-          <w:szCs w:val="28"/>
-          <w:lang w:bidi="fa-IR"/>
-        </w:rPr>
-        <w:t>] }</w:t>
-      </w:r>
-      <w:proofErr w:type="gramEnd"/>
-      <w:r>
-        <w:rPr>
-          <w:rFonts w:asciiTheme="majorBidi" w:hAnsiTheme="majorBidi" w:cstheme="majorBidi"/>
-          <w:b/>
-          <w:bCs/>
-          <w:i/>
-          <w:iCs/>
-          <w:sz w:val="28"/>
-          <w:szCs w:val="28"/>
-          <w:lang w:bidi="fa-IR"/>
-        </w:rPr>
-        <w:t>}</w:t>
+        <w:t>['web02']['ansible_default_ipv4']['address'] }}</w:t>
       </w:r>
     </w:p>
     <w:p>
@@ -22194,35 +22279,7 @@
           <w:szCs w:val="28"/>
           <w:lang w:bidi="fa-IR"/>
         </w:rPr>
-        <w:t>['web'</w:t>
-      </w:r>
-      <w:proofErr w:type="gramStart"/>
-      <w:r>
-        <w:rPr>
-          <w:rFonts w:asciiTheme="majorBidi" w:hAnsiTheme="majorBidi" w:cstheme="majorBidi"/>
-          <w:b/>
-          <w:bCs/>
-          <w:i/>
-          <w:iCs/>
-          <w:sz w:val="28"/>
-          <w:szCs w:val="28"/>
-          <w:lang w:bidi="fa-IR"/>
-        </w:rPr>
-        <w:t>] }</w:t>
-      </w:r>
-      <w:proofErr w:type="gramEnd"/>
-      <w:r>
-        <w:rPr>
-          <w:rFonts w:asciiTheme="majorBidi" w:hAnsiTheme="majorBidi" w:cstheme="majorBidi"/>
-          <w:b/>
-          <w:bCs/>
-          <w:i/>
-          <w:iCs/>
-          <w:sz w:val="28"/>
-          <w:szCs w:val="28"/>
-          <w:lang w:bidi="fa-IR"/>
-        </w:rPr>
-        <w:t>} returns a list like ['web01', 'web02']</w:t>
+        <w:t>['web'] }} returns a list like ['web01', 'web02']</w:t>
       </w:r>
       <w:r>
         <w:rPr>
@@ -22420,7 +22477,7 @@
           <w:szCs w:val="28"/>
           <w:lang w:bidi="fa-IR"/>
         </w:rPr>
-        <w:t>{{ i</w:t>
+        <w:t xml:space="preserve">{{ </w:t>
       </w:r>
       <w:proofErr w:type="spellStart"/>
       <w:r>
@@ -22434,7 +22491,7 @@
           <w:szCs w:val="28"/>
           <w:lang w:bidi="fa-IR"/>
         </w:rPr>
-        <w:t>nventory</w:t>
+        <w:t>inventory</w:t>
       </w:r>
       <w:proofErr w:type="gramEnd"/>
       <w:r>
@@ -22448,9 +22505,9 @@
           <w:szCs w:val="28"/>
           <w:lang w:bidi="fa-IR"/>
         </w:rPr>
-        <w:t>_</w:t>
-      </w:r>
-      <w:proofErr w:type="gramStart"/>
+        <w:t>_hostname</w:t>
+      </w:r>
+      <w:proofErr w:type="spellEnd"/>
       <w:r>
         <w:rPr>
           <w:rFonts w:asciiTheme="majorBidi" w:hAnsiTheme="majorBidi" w:cstheme="majorBidi"/>
@@ -22462,35 +22519,7 @@
           <w:szCs w:val="28"/>
           <w:lang w:bidi="fa-IR"/>
         </w:rPr>
-        <w:t>hostname</w:t>
-      </w:r>
-      <w:proofErr w:type="spellEnd"/>
-      <w:r>
-        <w:rPr>
-          <w:rFonts w:asciiTheme="majorBidi" w:hAnsiTheme="majorBidi" w:cstheme="majorBidi"/>
-          <w:b/>
-          <w:bCs/>
-          <w:i/>
-          <w:iCs/>
-          <w:sz w:val="28"/>
-          <w:szCs w:val="28"/>
-          <w:lang w:bidi="fa-IR"/>
-        </w:rPr>
-        <w:t xml:space="preserve"> }</w:t>
-      </w:r>
-      <w:proofErr w:type="gramEnd"/>
-      <w:r>
-        <w:rPr>
-          <w:rFonts w:asciiTheme="majorBidi" w:hAnsiTheme="majorBidi" w:cstheme="majorBidi"/>
-          <w:b/>
-          <w:bCs/>
-          <w:i/>
-          <w:iCs/>
-          <w:sz w:val="28"/>
-          <w:szCs w:val="28"/>
-          <w:lang w:bidi="fa-IR"/>
-        </w:rPr>
-        <w:t>}</w:t>
+        <w:t xml:space="preserve"> }}</w:t>
       </w:r>
     </w:p>
     <w:p>
@@ -22526,6 +22555,7 @@
           <w:szCs w:val="28"/>
           <w:lang w:bidi="fa-IR"/>
         </w:rPr>
+        <w:lastRenderedPageBreak/>
         <w:t>group_names</w:t>
       </w:r>
       <w:proofErr w:type="spellEnd"/>
@@ -23019,7 +23049,7 @@
           </mc:Choice>
           <mc:Fallback>
             <w:pict>
-              <v:rect w14:anchorId="74F9D6ED" id="_x0000_s1045" style="position:absolute;left:0;text-align:left;margin-left:0;margin-top:21.1pt;width:231.6pt;height:60pt;z-index:251680768;visibility:visible;mso-wrap-style:square;mso-width-percent:0;mso-height-percent:0;mso-wrap-distance-left:9pt;mso-wrap-distance-top:0;mso-wrap-distance-right:9pt;mso-wrap-distance-bottom:0;mso-position-horizontal:left;mso-position-horizontal-relative:margin;mso-position-vertical:absolute;mso-position-vertical-relative:text;mso-width-percent:0;mso-height-percent:0;mso-width-relative:margin;mso-height-relative:margin;v-text-anchor:middle" o:gfxdata="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" fillcolor="black [3200]" strokecolor="black [480]" strokeweight="1pt">
+              <v:rect w14:anchorId="74F9D6ED" id="_x0000_s1046" style="position:absolute;left:0;text-align:left;margin-left:0;margin-top:21.1pt;width:231.6pt;height:60pt;z-index:251680768;visibility:visible;mso-wrap-style:square;mso-width-percent:0;mso-height-percent:0;mso-wrap-distance-left:9pt;mso-wrap-distance-top:0;mso-wrap-distance-right:9pt;mso-wrap-distance-bottom:0;mso-position-horizontal:left;mso-position-horizontal-relative:margin;mso-position-vertical:absolute;mso-position-vertical-relative:text;mso-width-percent:0;mso-height-percent:0;mso-width-relative:margin;mso-height-relative:margin;v-text-anchor:middle" o:gfxdata="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" fillcolor="black [3200]" strokecolor="black [480]" strokeweight="1pt">
                 <v:textbox>
                   <w:txbxContent>
                     <w:p>
@@ -23234,7 +23264,6 @@
           <w:szCs w:val="28"/>
           <w:lang w:bidi="fa-IR"/>
         </w:rPr>
-        <w:lastRenderedPageBreak/>
         <w:t>Note</w:t>
       </w:r>
       <w:r>
@@ -24164,21 +24193,7 @@
                                 <w:szCs w:val="28"/>
                                 <w:lang w:bidi="fa-IR"/>
                               </w:rPr>
-                              <w:t xml:space="preserve"> }} </w:t>
-                            </w:r>
-                            <w:proofErr w:type="gramStart"/>
-                            <w:r>
-                              <w:rPr>
-                                <w:rFonts w:asciiTheme="majorBidi" w:hAnsiTheme="majorBidi" w:cstheme="majorBidi"/>
-                                <w:b/>
-                                <w:bCs/>
-                                <w:i/>
-                                <w:iCs/>
-                                <w:sz w:val="28"/>
-                                <w:szCs w:val="28"/>
-                                <w:lang w:bidi="fa-IR"/>
-                              </w:rPr>
-                              <w:t xml:space="preserve">{{ </w:t>
+                              <w:t xml:space="preserve"> }} {{ </w:t>
                             </w:r>
                             <w:proofErr w:type="spellStart"/>
                             <w:r>
@@ -24195,7 +24210,6 @@
                               <w:t>hostvars</w:t>
                             </w:r>
                             <w:proofErr w:type="spellEnd"/>
-                            <w:proofErr w:type="gramEnd"/>
                             <w:r>
                               <w:rPr>
                                 <w:rFonts w:asciiTheme="majorBidi" w:hAnsiTheme="majorBidi" w:cstheme="majorBidi"/>
@@ -24207,63 +24221,7 @@
                                 <w:szCs w:val="28"/>
                                 <w:lang w:bidi="fa-IR"/>
                               </w:rPr>
-                              <w:t>[host]['ansible_default_ipv4</w:t>
-                            </w:r>
-                            <w:proofErr w:type="gramStart"/>
-                            <w:r>
-                              <w:rPr>
-                                <w:rFonts w:asciiTheme="majorBidi" w:hAnsiTheme="majorBidi" w:cstheme="majorBidi"/>
-                                <w:b/>
-                                <w:bCs/>
-                                <w:i/>
-                                <w:iCs/>
-                                <w:sz w:val="28"/>
-                                <w:szCs w:val="28"/>
-                                <w:lang w:bidi="fa-IR"/>
-                              </w:rPr>
-                              <w:t>'][</w:t>
-                            </w:r>
-                            <w:proofErr w:type="gramEnd"/>
-                            <w:r>
-                              <w:rPr>
-                                <w:rFonts w:asciiTheme="majorBidi" w:hAnsiTheme="majorBidi" w:cstheme="majorBidi"/>
-                                <w:b/>
-                                <w:bCs/>
-                                <w:i/>
-                                <w:iCs/>
-                                <w:sz w:val="28"/>
-                                <w:szCs w:val="28"/>
-                                <w:lang w:bidi="fa-IR"/>
-                              </w:rPr>
-                              <w:t>'address'</w:t>
-                            </w:r>
-                            <w:proofErr w:type="gramStart"/>
-                            <w:r>
-                              <w:rPr>
-                                <w:rFonts w:asciiTheme="majorBidi" w:hAnsiTheme="majorBidi" w:cstheme="majorBidi"/>
-                                <w:b/>
-                                <w:bCs/>
-                                <w:i/>
-                                <w:iCs/>
-                                <w:sz w:val="28"/>
-                                <w:szCs w:val="28"/>
-                                <w:lang w:bidi="fa-IR"/>
-                              </w:rPr>
-                              <w:t>] }</w:t>
-                            </w:r>
-                            <w:proofErr w:type="gramEnd"/>
-                            <w:r>
-                              <w:rPr>
-                                <w:rFonts w:asciiTheme="majorBidi" w:hAnsiTheme="majorBidi" w:cstheme="majorBidi"/>
-                                <w:b/>
-                                <w:bCs/>
-                                <w:i/>
-                                <w:iCs/>
-                                <w:sz w:val="28"/>
-                                <w:szCs w:val="28"/>
-                                <w:lang w:bidi="fa-IR"/>
-                              </w:rPr>
-                              <w:t>}</w:t>
+                              <w:t>[host]['ansible_default_ipv4']['address'] }}</w:t>
                             </w:r>
                           </w:p>
                           <w:p>
@@ -24350,7 +24308,7 @@
           </mc:Choice>
           <mc:Fallback>
             <w:pict>
-              <v:rect w14:anchorId="31160047" id="_x0000_s1046" style="position:absolute;margin-left:0;margin-top:22.45pt;width:416.4pt;height:60.6pt;z-index:251681792;visibility:visible;mso-wrap-style:square;mso-width-percent:0;mso-height-percent:0;mso-wrap-distance-left:9pt;mso-wrap-distance-top:0;mso-wrap-distance-right:9pt;mso-wrap-distance-bottom:0;mso-position-horizontal:left;mso-position-horizontal-relative:margin;mso-position-vertical:absolute;mso-position-vertical-relative:text;mso-width-percent:0;mso-height-percent:0;mso-width-relative:margin;mso-height-relative:margin;v-text-anchor:middle" o:gfxdata="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" fillcolor="black [3200]" strokecolor="black [480]" strokeweight="1pt">
+              <v:rect w14:anchorId="31160047" id="_x0000_s1047" style="position:absolute;margin-left:0;margin-top:22.45pt;width:416.4pt;height:60.6pt;z-index:251681792;visibility:visible;mso-wrap-style:square;mso-width-percent:0;mso-height-percent:0;mso-wrap-distance-left:9pt;mso-wrap-distance-top:0;mso-wrap-distance-right:9pt;mso-wrap-distance-bottom:0;mso-position-horizontal:left;mso-position-horizontal-relative:margin;mso-position-vertical:absolute;mso-position-vertical-relative:text;mso-width-percent:0;mso-height-percent:0;mso-width-relative:margin;mso-height-relative:margin;v-text-anchor:middle" o:gfxdata="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" fillcolor="black [3200]" strokecolor="black [480]" strokeweight="1pt">
                 <v:textbox>
                   <w:txbxContent>
                     <w:p>
@@ -24434,21 +24392,7 @@
                           <w:szCs w:val="28"/>
                           <w:lang w:bidi="fa-IR"/>
                         </w:rPr>
-                        <w:t xml:space="preserve"> }} </w:t>
-                      </w:r>
-                      <w:proofErr w:type="gramStart"/>
-                      <w:r>
-                        <w:rPr>
-                          <w:rFonts w:asciiTheme="majorBidi" w:hAnsiTheme="majorBidi" w:cstheme="majorBidi"/>
-                          <w:b/>
-                          <w:bCs/>
-                          <w:i/>
-                          <w:iCs/>
-                          <w:sz w:val="28"/>
-                          <w:szCs w:val="28"/>
-                          <w:lang w:bidi="fa-IR"/>
-                        </w:rPr>
-                        <w:t xml:space="preserve">{{ </w:t>
+                        <w:t xml:space="preserve"> }} {{ </w:t>
                       </w:r>
                       <w:proofErr w:type="spellStart"/>
                       <w:r>
@@ -24465,7 +24409,6 @@
                         <w:t>hostvars</w:t>
                       </w:r>
                       <w:proofErr w:type="spellEnd"/>
-                      <w:proofErr w:type="gramEnd"/>
                       <w:r>
                         <w:rPr>
                           <w:rFonts w:asciiTheme="majorBidi" w:hAnsiTheme="majorBidi" w:cstheme="majorBidi"/>
@@ -24477,63 +24420,7 @@
                           <w:szCs w:val="28"/>
                           <w:lang w:bidi="fa-IR"/>
                         </w:rPr>
-                        <w:t>[host]['ansible_default_ipv4</w:t>
-                      </w:r>
-                      <w:proofErr w:type="gramStart"/>
-                      <w:r>
-                        <w:rPr>
-                          <w:rFonts w:asciiTheme="majorBidi" w:hAnsiTheme="majorBidi" w:cstheme="majorBidi"/>
-                          <w:b/>
-                          <w:bCs/>
-                          <w:i/>
-                          <w:iCs/>
-                          <w:sz w:val="28"/>
-                          <w:szCs w:val="28"/>
-                          <w:lang w:bidi="fa-IR"/>
-                        </w:rPr>
-                        <w:t>'][</w:t>
-                      </w:r>
-                      <w:proofErr w:type="gramEnd"/>
-                      <w:r>
-                        <w:rPr>
-                          <w:rFonts w:asciiTheme="majorBidi" w:hAnsiTheme="majorBidi" w:cstheme="majorBidi"/>
-                          <w:b/>
-                          <w:bCs/>
-                          <w:i/>
-                          <w:iCs/>
-                          <w:sz w:val="28"/>
-                          <w:szCs w:val="28"/>
-                          <w:lang w:bidi="fa-IR"/>
-                        </w:rPr>
-                        <w:t>'address'</w:t>
-                      </w:r>
-                      <w:proofErr w:type="gramStart"/>
-                      <w:r>
-                        <w:rPr>
-                          <w:rFonts w:asciiTheme="majorBidi" w:hAnsiTheme="majorBidi" w:cstheme="majorBidi"/>
-                          <w:b/>
-                          <w:bCs/>
-                          <w:i/>
-                          <w:iCs/>
-                          <w:sz w:val="28"/>
-                          <w:szCs w:val="28"/>
-                          <w:lang w:bidi="fa-IR"/>
-                        </w:rPr>
-                        <w:t>] }</w:t>
-                      </w:r>
-                      <w:proofErr w:type="gramEnd"/>
-                      <w:r>
-                        <w:rPr>
-                          <w:rFonts w:asciiTheme="majorBidi" w:hAnsiTheme="majorBidi" w:cstheme="majorBidi"/>
-                          <w:b/>
-                          <w:bCs/>
-                          <w:i/>
-                          <w:iCs/>
-                          <w:sz w:val="28"/>
-                          <w:szCs w:val="28"/>
-                          <w:lang w:bidi="fa-IR"/>
-                        </w:rPr>
-                        <w:t>}</w:t>
+                        <w:t>[host]['ansible_default_ipv4']['address'] }}</w:t>
                       </w:r>
                     </w:p>
                     <w:p>
@@ -24691,7 +24578,7 @@
 </file>
 
 <file path=word/numbering.xml><?xml version="1.0" encoding="utf-8"?>
-<w:numbering xmlns:wpc="http://schemas.microsoft.com/office/word/2010/wordprocessingCanvas" xmlns:cx="http://schemas.microsoft.com/office/drawing/2014/chartex" xmlns:cx1="http://schemas.microsoft.com/office/drawing/2015/9/8/chartex" xmlns:cx2="http://schemas.microsoft.com/office/drawing/2015/10/21/chartex" xmlns:cx3="http://schemas.microsoft.com/office/drawing/2016/5/9/chartex" xmlns:cx4="http://schemas.microsoft.com/office/drawing/2016/5/10/chartex" xmlns:cx5="http://schemas.microsoft.com/office/drawing/2016/5/11/chartex" xmlns:cx6="http://schemas.microsoft.com/office/drawing/2016/5/12/chartex" xmlns:cx7="http://schemas.microsoft.com/office/drawing/2016/5/13/chartex" xmlns:cx8="http://schemas.microsoft.com/office/drawing/2016/5/14/chartex" xmlns:mc="http://schemas.openxmlformats.org/markup-compatibility/2006" xmlns:aink="http://schemas.microsoft.com/office/drawing/2016/ink" xmlns:am3d="http://schemas.microsoft.com/office/drawing/2017/model3d" xmlns:o="urn:schemas-microsoft-com:office:office" xmlns:oel="http://schemas.microsoft.com/office/2019/extlst" xmlns:r="http://schemas.openxmlformats.org/officeDocument/2006/relationships" xmlns:m="http://schemas.openxmlformats.org/officeDocument/2006/math" xmlns:v="urn:schemas-microsoft-com:vml" xmlns:wp14="http://schemas.microsoft.com/office/word/2010/wordprocessingDrawing" xmlns:wp="http://schemas.openxmlformats.org/drawingml/2006/wordprocessingDrawing" xmlns:w10="urn:schemas-microsoft-com:office:word" xmlns:w="http://schemas.openxmlformats.org/wordprocessingml/2006/main" xmlns:w14="http://schemas.microsoft.com/office/word/2010/wordml" xmlns:w15="http://schemas.microsoft.com/office/word/2012/wordml" xmlns:w16cex="http://schemas.microsoft.com/office/word/2018/wordml/cex" xmlns:w16cid="http://schemas.microsoft.com/office/word/2016/wordml/cid" xmlns:w16="http://schemas.microsoft.com/office/word/2018/wordml" xmlns:w16du="http://schemas.microsoft.com/office/word/2023/wordml/word16du" xmlns:w16sdtdh="http://schemas.microsoft.com/office/word/2020/wordml/sdtdatahash" xmlns:w16sdtfl="http://schemas.microsoft.com/office/word/2024/wordml/sdtformatlock" xmlns:w16se="http://schemas.microsoft.com/office/word/2015/wordml/symex" xmlns:wpg="http://schemas.microsoft.com/office/word/2010/wordprocessingGroup" xmlns:wpi="http://schemas.microsoft.com/office/word/2010/wordprocessingInk" xmlns:wne="http://schemas.microsoft.com/office/word/2006/wordml" xmlns:wps="http://schemas.microsoft.com/office/word/2010/wordprocessingShape" mc:Ignorable="w14 w15 w16se w16cid w16 w16cex w16sdtdh w16sdtfl w16du wp14">
+<w:numbering xmlns:wpc="http://schemas.microsoft.com/office/word/2010/wordprocessingCanvas" xmlns:cx="http://schemas.microsoft.com/office/drawing/2014/chartex" xmlns:cx1="http://schemas.microsoft.com/office/drawing/2015/9/8/chartex" xmlns:cx2="http://schemas.microsoft.com/office/drawing/2015/10/21/chartex" xmlns:cx3="http://schemas.microsoft.com/office/drawing/2016/5/9/chartex" xmlns:cx4="http://schemas.microsoft.com/office/drawing/2016/5/10/chartex" xmlns:cx5="http://schemas.microsoft.com/office/drawing/2016/5/11/chartex" xmlns:cx6="http://schemas.microsoft.com/office/drawing/2016/5/12/chartex" xmlns:cx7="http://schemas.microsoft.com/office/drawing/2016/5/13/chartex" xmlns:cx8="http://schemas.microsoft.com/office/drawing/2016/5/14/chartex" xmlns:mc="http://schemas.openxmlformats.org/markup-compatibility/2006" xmlns:aink="http://schemas.microsoft.com/office/drawing/2016/ink" xmlns:am3d="http://schemas.microsoft.com/office/drawing/2017/model3d" xmlns:o="urn:schemas-microsoft-com:office:office" xmlns:oel="http://schemas.microsoft.com/office/2019/extlst" xmlns:r="http://schemas.openxmlformats.org/officeDocument/2006/relationships" xmlns:m="http://schemas.openxmlformats.org/officeDocument/2006/math" xmlns:v="urn:schemas-microsoft-com:vml" xmlns:wp14="http://schemas.microsoft.com/office/word/2010/wordprocessingDrawing" xmlns:wp="http://schemas.openxmlformats.org/drawingml/2006/wordprocessingDrawing" xmlns:w10="urn:schemas-microsoft-com:office:word" xmlns:w="http://schemas.openxmlformats.org/wordprocessingml/2006/main" xmlns:w14="http://schemas.microsoft.com/office/word/2010/wordml" xmlns:w15="http://schemas.microsoft.com/office/word/2012/wordml" xmlns:w16cex="http://schemas.microsoft.com/office/word/2018/wordml/cex" xmlns:w16cid="http://schemas.microsoft.com/office/word/2016/wordml/cid" xmlns:w16="http://schemas.microsoft.com/office/word/2018/wordml" xmlns:w16sdtdh="http://schemas.microsoft.com/office/word/2020/wordml/sdtdatahash" xmlns:w16se="http://schemas.microsoft.com/office/word/2015/wordml/symex" xmlns:wpg="http://schemas.microsoft.com/office/word/2010/wordprocessingGroup" xmlns:wpi="http://schemas.microsoft.com/office/word/2010/wordprocessingInk" xmlns:wne="http://schemas.microsoft.com/office/word/2006/wordml" xmlns:wps="http://schemas.microsoft.com/office/word/2010/wordprocessingShape" mc:Ignorable="w14 w15 w16se w16cid w16 w16cex w16sdtdh wp14">
   <w:abstractNum w:abstractNumId="0" w15:restartNumberingAfterBreak="0">
     <w:nsid w:val="017522CE"/>
     <w:multiLevelType w:val="hybridMultilevel"/>
@@ -25686,16 +25573,16 @@
     </w:lvl>
   </w:abstractNum>
   <w:abstractNum w:abstractNumId="9" w15:restartNumberingAfterBreak="0">
-    <w:nsid w:val="376B34F1"/>
+    <w:nsid w:val="364C4FC7"/>
     <w:multiLevelType w:val="hybridMultilevel"/>
-    <w:tmpl w:val="7A78BA16"/>
+    <w:tmpl w:val="B80C4804"/>
     <w:lvl w:ilvl="0" w:tplc="04090001">
       <w:start w:val="1"/>
       <w:numFmt w:val="bullet"/>
       <w:lvlText w:val=""/>
       <w:lvlJc w:val="left"/>
       <w:pPr>
-        <w:ind w:left="720" w:hanging="360"/>
+        <w:ind w:left="1080" w:hanging="360"/>
       </w:pPr>
       <w:rPr>
         <w:rFonts w:ascii="Symbol" w:hAnsi="Symbol" w:hint="default"/>
@@ -25707,7 +25594,7 @@
       <w:lvlText w:val="o"/>
       <w:lvlJc w:val="left"/>
       <w:pPr>
-        <w:ind w:left="1440" w:hanging="360"/>
+        <w:ind w:left="1800" w:hanging="360"/>
       </w:pPr>
       <w:rPr>
         <w:rFonts w:ascii="Courier New" w:hAnsi="Courier New" w:cs="Courier New" w:hint="default"/>
@@ -25719,7 +25606,7 @@
       <w:lvlText w:val=""/>
       <w:lvlJc w:val="left"/>
       <w:pPr>
-        <w:ind w:left="2160" w:hanging="360"/>
+        <w:ind w:left="2520" w:hanging="360"/>
       </w:pPr>
       <w:rPr>
         <w:rFonts w:ascii="Wingdings" w:hAnsi="Wingdings" w:hint="default"/>
@@ -25731,7 +25618,7 @@
       <w:lvlText w:val=""/>
       <w:lvlJc w:val="left"/>
       <w:pPr>
-        <w:ind w:left="2880" w:hanging="360"/>
+        <w:ind w:left="3240" w:hanging="360"/>
       </w:pPr>
       <w:rPr>
         <w:rFonts w:ascii="Symbol" w:hAnsi="Symbol" w:hint="default"/>
@@ -25743,7 +25630,7 @@
       <w:lvlText w:val="o"/>
       <w:lvlJc w:val="left"/>
       <w:pPr>
-        <w:ind w:left="3600" w:hanging="360"/>
+        <w:ind w:left="3960" w:hanging="360"/>
       </w:pPr>
       <w:rPr>
         <w:rFonts w:ascii="Courier New" w:hAnsi="Courier New" w:cs="Courier New" w:hint="default"/>
@@ -25755,7 +25642,7 @@
       <w:lvlText w:val=""/>
       <w:lvlJc w:val="left"/>
       <w:pPr>
-        <w:ind w:left="4320" w:hanging="360"/>
+        <w:ind w:left="4680" w:hanging="360"/>
       </w:pPr>
       <w:rPr>
         <w:rFonts w:ascii="Wingdings" w:hAnsi="Wingdings" w:hint="default"/>
@@ -25767,7 +25654,7 @@
       <w:lvlText w:val=""/>
       <w:lvlJc w:val="left"/>
       <w:pPr>
-        <w:ind w:left="5040" w:hanging="360"/>
+        <w:ind w:left="5400" w:hanging="360"/>
       </w:pPr>
       <w:rPr>
         <w:rFonts w:ascii="Symbol" w:hAnsi="Symbol" w:hint="default"/>
@@ -25779,7 +25666,7 @@
       <w:lvlText w:val="o"/>
       <w:lvlJc w:val="left"/>
       <w:pPr>
-        <w:ind w:left="5760" w:hanging="360"/>
+        <w:ind w:left="6120" w:hanging="360"/>
       </w:pPr>
       <w:rPr>
         <w:rFonts w:ascii="Courier New" w:hAnsi="Courier New" w:cs="Courier New" w:hint="default"/>
@@ -25791,7 +25678,7 @@
       <w:lvlText w:val=""/>
       <w:lvlJc w:val="left"/>
       <w:pPr>
-        <w:ind w:left="6480" w:hanging="360"/>
+        <w:ind w:left="6840" w:hanging="360"/>
       </w:pPr>
       <w:rPr>
         <w:rFonts w:ascii="Wingdings" w:hAnsi="Wingdings" w:hint="default"/>
@@ -25799,9 +25686,9 @@
     </w:lvl>
   </w:abstractNum>
   <w:abstractNum w:abstractNumId="10" w15:restartNumberingAfterBreak="0">
-    <w:nsid w:val="3FA30508"/>
+    <w:nsid w:val="376B34F1"/>
     <w:multiLevelType w:val="hybridMultilevel"/>
-    <w:tmpl w:val="E8E08986"/>
+    <w:tmpl w:val="7A78BA16"/>
     <w:lvl w:ilvl="0" w:tplc="04090001">
       <w:start w:val="1"/>
       <w:numFmt w:val="bullet"/>
@@ -25912,9 +25799,9 @@
     </w:lvl>
   </w:abstractNum>
   <w:abstractNum w:abstractNumId="11" w15:restartNumberingAfterBreak="0">
-    <w:nsid w:val="448E354C"/>
+    <w:nsid w:val="3FA30508"/>
     <w:multiLevelType w:val="hybridMultilevel"/>
-    <w:tmpl w:val="6A06D854"/>
+    <w:tmpl w:val="E8E08986"/>
     <w:lvl w:ilvl="0" w:tplc="04090001">
       <w:start w:val="1"/>
       <w:numFmt w:val="bullet"/>
@@ -26025,9 +25912,9 @@
     </w:lvl>
   </w:abstractNum>
   <w:abstractNum w:abstractNumId="12" w15:restartNumberingAfterBreak="0">
-    <w:nsid w:val="48A65F4A"/>
+    <w:nsid w:val="448E354C"/>
     <w:multiLevelType w:val="hybridMultilevel"/>
-    <w:tmpl w:val="ECBA2F7E"/>
+    <w:tmpl w:val="6A06D854"/>
     <w:lvl w:ilvl="0" w:tplc="04090001">
       <w:start w:val="1"/>
       <w:numFmt w:val="bullet"/>
@@ -26138,9 +26025,9 @@
     </w:lvl>
   </w:abstractNum>
   <w:abstractNum w:abstractNumId="13" w15:restartNumberingAfterBreak="0">
-    <w:nsid w:val="4D1261BC"/>
+    <w:nsid w:val="48A65F4A"/>
     <w:multiLevelType w:val="hybridMultilevel"/>
-    <w:tmpl w:val="7FEE5908"/>
+    <w:tmpl w:val="ECBA2F7E"/>
     <w:lvl w:ilvl="0" w:tplc="04090001">
       <w:start w:val="1"/>
       <w:numFmt w:val="bullet"/>
@@ -26251,9 +26138,9 @@
     </w:lvl>
   </w:abstractNum>
   <w:abstractNum w:abstractNumId="14" w15:restartNumberingAfterBreak="0">
-    <w:nsid w:val="526D615D"/>
+    <w:nsid w:val="4D1261BC"/>
     <w:multiLevelType w:val="hybridMultilevel"/>
-    <w:tmpl w:val="F37EF0D6"/>
+    <w:tmpl w:val="7FEE5908"/>
     <w:lvl w:ilvl="0" w:tplc="04090001">
       <w:start w:val="1"/>
       <w:numFmt w:val="bullet"/>
@@ -26364,6 +26251,119 @@
     </w:lvl>
   </w:abstractNum>
   <w:abstractNum w:abstractNumId="15" w15:restartNumberingAfterBreak="0">
+    <w:nsid w:val="526D615D"/>
+    <w:multiLevelType w:val="hybridMultilevel"/>
+    <w:tmpl w:val="F37EF0D6"/>
+    <w:lvl w:ilvl="0" w:tplc="04090001">
+      <w:start w:val="1"/>
+      <w:numFmt w:val="bullet"/>
+      <w:lvlText w:val=""/>
+      <w:lvlJc w:val="left"/>
+      <w:pPr>
+        <w:ind w:left="720" w:hanging="360"/>
+      </w:pPr>
+      <w:rPr>
+        <w:rFonts w:ascii="Symbol" w:hAnsi="Symbol" w:hint="default"/>
+      </w:rPr>
+    </w:lvl>
+    <w:lvl w:ilvl="1" w:tplc="04090003" w:tentative="1">
+      <w:start w:val="1"/>
+      <w:numFmt w:val="bullet"/>
+      <w:lvlText w:val="o"/>
+      <w:lvlJc w:val="left"/>
+      <w:pPr>
+        <w:ind w:left="1440" w:hanging="360"/>
+      </w:pPr>
+      <w:rPr>
+        <w:rFonts w:ascii="Courier New" w:hAnsi="Courier New" w:cs="Courier New" w:hint="default"/>
+      </w:rPr>
+    </w:lvl>
+    <w:lvl w:ilvl="2" w:tplc="04090005" w:tentative="1">
+      <w:start w:val="1"/>
+      <w:numFmt w:val="bullet"/>
+      <w:lvlText w:val=""/>
+      <w:lvlJc w:val="left"/>
+      <w:pPr>
+        <w:ind w:left="2160" w:hanging="360"/>
+      </w:pPr>
+      <w:rPr>
+        <w:rFonts w:ascii="Wingdings" w:hAnsi="Wingdings" w:hint="default"/>
+      </w:rPr>
+    </w:lvl>
+    <w:lvl w:ilvl="3" w:tplc="04090001" w:tentative="1">
+      <w:start w:val="1"/>
+      <w:numFmt w:val="bullet"/>
+      <w:lvlText w:val=""/>
+      <w:lvlJc w:val="left"/>
+      <w:pPr>
+        <w:ind w:left="2880" w:hanging="360"/>
+      </w:pPr>
+      <w:rPr>
+        <w:rFonts w:ascii="Symbol" w:hAnsi="Symbol" w:hint="default"/>
+      </w:rPr>
+    </w:lvl>
+    <w:lvl w:ilvl="4" w:tplc="04090003" w:tentative="1">
+      <w:start w:val="1"/>
+      <w:numFmt w:val="bullet"/>
+      <w:lvlText w:val="o"/>
+      <w:lvlJc w:val="left"/>
+      <w:pPr>
+        <w:ind w:left="3600" w:hanging="360"/>
+      </w:pPr>
+      <w:rPr>
+        <w:rFonts w:ascii="Courier New" w:hAnsi="Courier New" w:cs="Courier New" w:hint="default"/>
+      </w:rPr>
+    </w:lvl>
+    <w:lvl w:ilvl="5" w:tplc="04090005" w:tentative="1">
+      <w:start w:val="1"/>
+      <w:numFmt w:val="bullet"/>
+      <w:lvlText w:val=""/>
+      <w:lvlJc w:val="left"/>
+      <w:pPr>
+        <w:ind w:left="4320" w:hanging="360"/>
+      </w:pPr>
+      <w:rPr>
+        <w:rFonts w:ascii="Wingdings" w:hAnsi="Wingdings" w:hint="default"/>
+      </w:rPr>
+    </w:lvl>
+    <w:lvl w:ilvl="6" w:tplc="04090001" w:tentative="1">
+      <w:start w:val="1"/>
+      <w:numFmt w:val="bullet"/>
+      <w:lvlText w:val=""/>
+      <w:lvlJc w:val="left"/>
+      <w:pPr>
+        <w:ind w:left="5040" w:hanging="360"/>
+      </w:pPr>
+      <w:rPr>
+        <w:rFonts w:ascii="Symbol" w:hAnsi="Symbol" w:hint="default"/>
+      </w:rPr>
+    </w:lvl>
+    <w:lvl w:ilvl="7" w:tplc="04090003" w:tentative="1">
+      <w:start w:val="1"/>
+      <w:numFmt w:val="bullet"/>
+      <w:lvlText w:val="o"/>
+      <w:lvlJc w:val="left"/>
+      <w:pPr>
+        <w:ind w:left="5760" w:hanging="360"/>
+      </w:pPr>
+      <w:rPr>
+        <w:rFonts w:ascii="Courier New" w:hAnsi="Courier New" w:cs="Courier New" w:hint="default"/>
+      </w:rPr>
+    </w:lvl>
+    <w:lvl w:ilvl="8" w:tplc="04090005" w:tentative="1">
+      <w:start w:val="1"/>
+      <w:numFmt w:val="bullet"/>
+      <w:lvlText w:val=""/>
+      <w:lvlJc w:val="left"/>
+      <w:pPr>
+        <w:ind w:left="6480" w:hanging="360"/>
+      </w:pPr>
+      <w:rPr>
+        <w:rFonts w:ascii="Wingdings" w:hAnsi="Wingdings" w:hint="default"/>
+      </w:rPr>
+    </w:lvl>
+  </w:abstractNum>
+  <w:abstractNum w:abstractNumId="16" w15:restartNumberingAfterBreak="0">
     <w:nsid w:val="571B6767"/>
     <w:multiLevelType w:val="hybridMultilevel"/>
     <w:tmpl w:val="2E2A58B2"/>
@@ -26449,7 +26449,7 @@
       </w:pPr>
     </w:lvl>
   </w:abstractNum>
-  <w:abstractNum w:abstractNumId="16" w15:restartNumberingAfterBreak="0">
+  <w:abstractNum w:abstractNumId="17" w15:restartNumberingAfterBreak="0">
     <w:nsid w:val="5D3C229E"/>
     <w:multiLevelType w:val="hybridMultilevel"/>
     <w:tmpl w:val="0D3E70B4"/>
@@ -26535,7 +26535,7 @@
       </w:pPr>
     </w:lvl>
   </w:abstractNum>
-  <w:abstractNum w:abstractNumId="17" w15:restartNumberingAfterBreak="0">
+  <w:abstractNum w:abstractNumId="18" w15:restartNumberingAfterBreak="0">
     <w:nsid w:val="5FB279F4"/>
     <w:multiLevelType w:val="hybridMultilevel"/>
     <w:tmpl w:val="B13AA3EE"/>
@@ -26648,7 +26648,120 @@
       </w:rPr>
     </w:lvl>
   </w:abstractNum>
-  <w:abstractNum w:abstractNumId="18" w15:restartNumberingAfterBreak="0">
+  <w:abstractNum w:abstractNumId="19" w15:restartNumberingAfterBreak="0">
+    <w:nsid w:val="664A7CB5"/>
+    <w:multiLevelType w:val="hybridMultilevel"/>
+    <w:tmpl w:val="EA72BFC2"/>
+    <w:lvl w:ilvl="0" w:tplc="04090003">
+      <w:start w:val="1"/>
+      <w:numFmt w:val="bullet"/>
+      <w:lvlText w:val="o"/>
+      <w:lvlJc w:val="left"/>
+      <w:pPr>
+        <w:ind w:left="1080" w:hanging="360"/>
+      </w:pPr>
+      <w:rPr>
+        <w:rFonts w:ascii="Courier New" w:hAnsi="Courier New" w:cs="Courier New" w:hint="default"/>
+      </w:rPr>
+    </w:lvl>
+    <w:lvl w:ilvl="1" w:tplc="04090003" w:tentative="1">
+      <w:start w:val="1"/>
+      <w:numFmt w:val="bullet"/>
+      <w:lvlText w:val="o"/>
+      <w:lvlJc w:val="left"/>
+      <w:pPr>
+        <w:ind w:left="1800" w:hanging="360"/>
+      </w:pPr>
+      <w:rPr>
+        <w:rFonts w:ascii="Courier New" w:hAnsi="Courier New" w:cs="Courier New" w:hint="default"/>
+      </w:rPr>
+    </w:lvl>
+    <w:lvl w:ilvl="2" w:tplc="04090005" w:tentative="1">
+      <w:start w:val="1"/>
+      <w:numFmt w:val="bullet"/>
+      <w:lvlText w:val=""/>
+      <w:lvlJc w:val="left"/>
+      <w:pPr>
+        <w:ind w:left="2520" w:hanging="360"/>
+      </w:pPr>
+      <w:rPr>
+        <w:rFonts w:ascii="Wingdings" w:hAnsi="Wingdings" w:hint="default"/>
+      </w:rPr>
+    </w:lvl>
+    <w:lvl w:ilvl="3" w:tplc="04090001" w:tentative="1">
+      <w:start w:val="1"/>
+      <w:numFmt w:val="bullet"/>
+      <w:lvlText w:val=""/>
+      <w:lvlJc w:val="left"/>
+      <w:pPr>
+        <w:ind w:left="3240" w:hanging="360"/>
+      </w:pPr>
+      <w:rPr>
+        <w:rFonts w:ascii="Symbol" w:hAnsi="Symbol" w:hint="default"/>
+      </w:rPr>
+    </w:lvl>
+    <w:lvl w:ilvl="4" w:tplc="04090003" w:tentative="1">
+      <w:start w:val="1"/>
+      <w:numFmt w:val="bullet"/>
+      <w:lvlText w:val="o"/>
+      <w:lvlJc w:val="left"/>
+      <w:pPr>
+        <w:ind w:left="3960" w:hanging="360"/>
+      </w:pPr>
+      <w:rPr>
+        <w:rFonts w:ascii="Courier New" w:hAnsi="Courier New" w:cs="Courier New" w:hint="default"/>
+      </w:rPr>
+    </w:lvl>
+    <w:lvl w:ilvl="5" w:tplc="04090005" w:tentative="1">
+      <w:start w:val="1"/>
+      <w:numFmt w:val="bullet"/>
+      <w:lvlText w:val=""/>
+      <w:lvlJc w:val="left"/>
+      <w:pPr>
+        <w:ind w:left="4680" w:hanging="360"/>
+      </w:pPr>
+      <w:rPr>
+        <w:rFonts w:ascii="Wingdings" w:hAnsi="Wingdings" w:hint="default"/>
+      </w:rPr>
+    </w:lvl>
+    <w:lvl w:ilvl="6" w:tplc="04090001" w:tentative="1">
+      <w:start w:val="1"/>
+      <w:numFmt w:val="bullet"/>
+      <w:lvlText w:val=""/>
+      <w:lvlJc w:val="left"/>
+      <w:pPr>
+        <w:ind w:left="5400" w:hanging="360"/>
+      </w:pPr>
+      <w:rPr>
+        <w:rFonts w:ascii="Symbol" w:hAnsi="Symbol" w:hint="default"/>
+      </w:rPr>
+    </w:lvl>
+    <w:lvl w:ilvl="7" w:tplc="04090003" w:tentative="1">
+      <w:start w:val="1"/>
+      <w:numFmt w:val="bullet"/>
+      <w:lvlText w:val="o"/>
+      <w:lvlJc w:val="left"/>
+      <w:pPr>
+        <w:ind w:left="6120" w:hanging="360"/>
+      </w:pPr>
+      <w:rPr>
+        <w:rFonts w:ascii="Courier New" w:hAnsi="Courier New" w:cs="Courier New" w:hint="default"/>
+      </w:rPr>
+    </w:lvl>
+    <w:lvl w:ilvl="8" w:tplc="04090005" w:tentative="1">
+      <w:start w:val="1"/>
+      <w:numFmt w:val="bullet"/>
+      <w:lvlText w:val=""/>
+      <w:lvlJc w:val="left"/>
+      <w:pPr>
+        <w:ind w:left="6840" w:hanging="360"/>
+      </w:pPr>
+      <w:rPr>
+        <w:rFonts w:ascii="Wingdings" w:hAnsi="Wingdings" w:hint="default"/>
+      </w:rPr>
+    </w:lvl>
+  </w:abstractNum>
+  <w:abstractNum w:abstractNumId="20" w15:restartNumberingAfterBreak="0">
     <w:nsid w:val="74907CD4"/>
     <w:multiLevelType w:val="hybridMultilevel"/>
     <w:tmpl w:val="6DD88812"/>
@@ -26761,7 +26874,7 @@
       </w:rPr>
     </w:lvl>
   </w:abstractNum>
-  <w:abstractNum w:abstractNumId="19" w15:restartNumberingAfterBreak="0">
+  <w:abstractNum w:abstractNumId="21" w15:restartNumberingAfterBreak="0">
     <w:nsid w:val="7BAF357A"/>
     <w:multiLevelType w:val="hybridMultilevel"/>
     <w:tmpl w:val="91A61B90"/>
@@ -26875,13 +26988,13 @@
     </w:lvl>
   </w:abstractNum>
   <w:num w:numId="1" w16cid:durableId="369964109">
-    <w:abstractNumId w:val="9"/>
+    <w:abstractNumId w:val="10"/>
   </w:num>
   <w:num w:numId="2" w16cid:durableId="261451470">
     <w:abstractNumId w:val="3"/>
   </w:num>
   <w:num w:numId="3" w16cid:durableId="153224533">
-    <w:abstractNumId w:val="10"/>
+    <w:abstractNumId w:val="11"/>
   </w:num>
   <w:num w:numId="4" w16cid:durableId="1609894633">
     <w:abstractNumId w:val="8"/>
@@ -26893,22 +27006,22 @@
     <w:abstractNumId w:val="5"/>
   </w:num>
   <w:num w:numId="7" w16cid:durableId="1753236516">
-    <w:abstractNumId w:val="14"/>
+    <w:abstractNumId w:val="15"/>
   </w:num>
   <w:num w:numId="8" w16cid:durableId="1386680739">
-    <w:abstractNumId w:val="15"/>
+    <w:abstractNumId w:val="16"/>
   </w:num>
   <w:num w:numId="9" w16cid:durableId="1859200382">
     <w:abstractNumId w:val="4"/>
   </w:num>
   <w:num w:numId="10" w16cid:durableId="1950164342">
-    <w:abstractNumId w:val="16"/>
+    <w:abstractNumId w:val="17"/>
   </w:num>
   <w:num w:numId="11" w16cid:durableId="1755976766">
-    <w:abstractNumId w:val="11"/>
+    <w:abstractNumId w:val="12"/>
   </w:num>
   <w:num w:numId="12" w16cid:durableId="287930277">
-    <w:abstractNumId w:val="12"/>
+    <w:abstractNumId w:val="13"/>
   </w:num>
   <w:num w:numId="13" w16cid:durableId="441657204">
     <w:abstractNumId w:val="7"/>
@@ -26917,13 +27030,13 @@
     <w:abstractNumId w:val="6"/>
   </w:num>
   <w:num w:numId="15" w16cid:durableId="1345937136">
-    <w:abstractNumId w:val="18"/>
+    <w:abstractNumId w:val="20"/>
   </w:num>
   <w:num w:numId="16" w16cid:durableId="1510023058">
-    <w:abstractNumId w:val="13"/>
+    <w:abstractNumId w:val="14"/>
   </w:num>
   <w:num w:numId="17" w16cid:durableId="915289343">
-    <w:abstractNumId w:val="17"/>
+    <w:abstractNumId w:val="18"/>
   </w:num>
   <w:num w:numId="18" w16cid:durableId="235944456">
     <w:abstractNumId w:val="2"/>
@@ -26932,13 +27045,19 @@
     <w:abstractNumId w:val="1"/>
   </w:num>
   <w:num w:numId="20" w16cid:durableId="2051874520">
+    <w:abstractNumId w:val="21"/>
+  </w:num>
+  <w:num w:numId="21" w16cid:durableId="1035231746">
+    <w:abstractNumId w:val="9"/>
+  </w:num>
+  <w:num w:numId="22" w16cid:durableId="2089842111">
     <w:abstractNumId w:val="19"/>
   </w:num>
 </w:numbering>
 </file>
 
 <file path=word/styles.xml><?xml version="1.0" encoding="utf-8"?>
-<w:styles xmlns:mc="http://schemas.openxmlformats.org/markup-compatibility/2006" xmlns:r="http://schemas.openxmlformats.org/officeDocument/2006/relationships" xmlns:w="http://schemas.openxmlformats.org/wordprocessingml/2006/main" xmlns:w14="http://schemas.microsoft.com/office/word/2010/wordml" xmlns:w15="http://schemas.microsoft.com/office/word/2012/wordml" xmlns:w16cex="http://schemas.microsoft.com/office/word/2018/wordml/cex" xmlns:w16cid="http://schemas.microsoft.com/office/word/2016/wordml/cid" xmlns:w16="http://schemas.microsoft.com/office/word/2018/wordml" xmlns:w16du="http://schemas.microsoft.com/office/word/2023/wordml/word16du" xmlns:w16sdtdh="http://schemas.microsoft.com/office/word/2020/wordml/sdtdatahash" xmlns:w16sdtfl="http://schemas.microsoft.com/office/word/2024/wordml/sdtformatlock" xmlns:w16se="http://schemas.microsoft.com/office/word/2015/wordml/symex" mc:Ignorable="w14 w15 w16se w16cid w16 w16cex w16sdtdh w16sdtfl w16du">
+<w:styles xmlns:mc="http://schemas.openxmlformats.org/markup-compatibility/2006" xmlns:r="http://schemas.openxmlformats.org/officeDocument/2006/relationships" xmlns:w="http://schemas.openxmlformats.org/wordprocessingml/2006/main" xmlns:w14="http://schemas.microsoft.com/office/word/2010/wordml" xmlns:w15="http://schemas.microsoft.com/office/word/2012/wordml" xmlns:w16cex="http://schemas.microsoft.com/office/word/2018/wordml/cex" xmlns:w16cid="http://schemas.microsoft.com/office/word/2016/wordml/cid" xmlns:w16="http://schemas.microsoft.com/office/word/2018/wordml" xmlns:w16sdtdh="http://schemas.microsoft.com/office/word/2020/wordml/sdtdatahash" xmlns:w16se="http://schemas.microsoft.com/office/word/2015/wordml/symex" mc:Ignorable="w14 w15 w16se w16cid w16 w16cex w16sdtdh">
   <w:docDefaults>
     <w:rPrDefault>
       <w:rPr>

</xml_diff>

<commit_message>
ansible - roles and variables updated
</commit_message>
<xml_diff>
--- a/Ansible/7-variables.docx
+++ b/Ansible/7-variables.docx
@@ -18013,25 +18013,7 @@
           <w:szCs w:val="28"/>
           <w:lang w:bidi="fa-IR"/>
         </w:rPr>
-        <w:t>.</w:t>
-      </w:r>
-      <w:r>
-        <w:rPr>
-          <w:rFonts w:asciiTheme="majorBidi" w:hAnsiTheme="majorBidi" w:cstheme="majorBidi"/>
-          <w:sz w:val="28"/>
-          <w:szCs w:val="28"/>
-          <w:lang w:bidi="fa-IR"/>
-        </w:rPr>
-        <w:t xml:space="preserve"> </w:t>
-      </w:r>
-      <w:r>
-        <w:rPr>
-          <w:rFonts w:asciiTheme="majorBidi" w:hAnsiTheme="majorBidi" w:cstheme="majorBidi"/>
-          <w:sz w:val="28"/>
-          <w:szCs w:val="28"/>
-          <w:lang w:bidi="fa-IR"/>
-        </w:rPr>
-        <w:t xml:space="preserve">While </w:t>
+        <w:t xml:space="preserve">. While </w:t>
       </w:r>
       <w:proofErr w:type="spellStart"/>
       <w:r>
@@ -19475,116 +19457,6 @@
     </w:p>
     <w:p>
       <w:pPr>
-        <w:jc w:val="both"/>
-        <w:rPr>
-          <w:rFonts w:asciiTheme="majorBidi" w:hAnsiTheme="majorBidi" w:cstheme="majorBidi"/>
-          <w:sz w:val="28"/>
-          <w:szCs w:val="28"/>
-          <w:lang w:bidi="fa-IR"/>
-        </w:rPr>
-      </w:pPr>
-    </w:p>
-    <w:p>
-      <w:pPr>
-        <w:jc w:val="both"/>
-        <w:rPr>
-          <w:rFonts w:asciiTheme="majorBidi" w:hAnsiTheme="majorBidi" w:cstheme="majorBidi"/>
-          <w:sz w:val="28"/>
-          <w:szCs w:val="28"/>
-          <w:lang w:bidi="fa-IR"/>
-        </w:rPr>
-      </w:pPr>
-    </w:p>
-    <w:p>
-      <w:pPr>
-        <w:jc w:val="both"/>
-        <w:rPr>
-          <w:rFonts w:asciiTheme="majorBidi" w:hAnsiTheme="majorBidi" w:cstheme="majorBidi"/>
-          <w:sz w:val="28"/>
-          <w:szCs w:val="28"/>
-          <w:lang w:bidi="fa-IR"/>
-        </w:rPr>
-      </w:pPr>
-    </w:p>
-    <w:p>
-      <w:pPr>
-        <w:jc w:val="both"/>
-        <w:rPr>
-          <w:rFonts w:asciiTheme="majorBidi" w:hAnsiTheme="majorBidi" w:cstheme="majorBidi"/>
-          <w:sz w:val="28"/>
-          <w:szCs w:val="28"/>
-          <w:lang w:bidi="fa-IR"/>
-        </w:rPr>
-      </w:pPr>
-    </w:p>
-    <w:p>
-      <w:pPr>
-        <w:jc w:val="both"/>
-        <w:rPr>
-          <w:rFonts w:asciiTheme="majorBidi" w:hAnsiTheme="majorBidi" w:cstheme="majorBidi"/>
-          <w:sz w:val="28"/>
-          <w:szCs w:val="28"/>
-          <w:lang w:bidi="fa-IR"/>
-        </w:rPr>
-      </w:pPr>
-    </w:p>
-    <w:p>
-      <w:pPr>
-        <w:jc w:val="both"/>
-        <w:rPr>
-          <w:rFonts w:asciiTheme="majorBidi" w:hAnsiTheme="majorBidi" w:cstheme="majorBidi"/>
-          <w:sz w:val="28"/>
-          <w:szCs w:val="28"/>
-          <w:lang w:bidi="fa-IR"/>
-        </w:rPr>
-      </w:pPr>
-    </w:p>
-    <w:p>
-      <w:pPr>
-        <w:jc w:val="both"/>
-        <w:rPr>
-          <w:rFonts w:asciiTheme="majorBidi" w:hAnsiTheme="majorBidi" w:cstheme="majorBidi"/>
-          <w:sz w:val="28"/>
-          <w:szCs w:val="28"/>
-          <w:lang w:bidi="fa-IR"/>
-        </w:rPr>
-      </w:pPr>
-    </w:p>
-    <w:p>
-      <w:pPr>
-        <w:jc w:val="both"/>
-        <w:rPr>
-          <w:rFonts w:asciiTheme="majorBidi" w:hAnsiTheme="majorBidi" w:cstheme="majorBidi"/>
-          <w:sz w:val="28"/>
-          <w:szCs w:val="28"/>
-          <w:lang w:bidi="fa-IR"/>
-        </w:rPr>
-      </w:pPr>
-    </w:p>
-    <w:p>
-      <w:pPr>
-        <w:jc w:val="both"/>
-        <w:rPr>
-          <w:rFonts w:asciiTheme="majorBidi" w:hAnsiTheme="majorBidi" w:cstheme="majorBidi"/>
-          <w:sz w:val="28"/>
-          <w:szCs w:val="28"/>
-          <w:lang w:bidi="fa-IR"/>
-        </w:rPr>
-      </w:pPr>
-    </w:p>
-    <w:p>
-      <w:pPr>
-        <w:jc w:val="both"/>
-        <w:rPr>
-          <w:rFonts w:asciiTheme="majorBidi" w:hAnsiTheme="majorBidi" w:cstheme="majorBidi"/>
-          <w:sz w:val="28"/>
-          <w:szCs w:val="28"/>
-          <w:lang w:bidi="fa-IR"/>
-        </w:rPr>
-      </w:pPr>
-    </w:p>
-    <w:p>
-      <w:pPr>
         <w:spacing w:after="80"/>
         <w:jc w:val="both"/>
         <w:rPr>
@@ -19605,6 +19477,7 @@
           <w:szCs w:val="40"/>
           <w:lang w:bidi="fa-IR"/>
         </w:rPr>
+        <w:lastRenderedPageBreak/>
         <w:t>Variable Precedence</w:t>
       </w:r>
     </w:p>
@@ -20495,7 +20368,6 @@
           <w:szCs w:val="36"/>
           <w:lang w:bidi="fa-IR"/>
         </w:rPr>
-        <w:lastRenderedPageBreak/>
         <w:t>Detailed Breakdown of Key Levels</w:t>
       </w:r>
       <w:r>
@@ -21015,6 +20887,7 @@
           <w:szCs w:val="28"/>
           <w:lang w:bidi="fa-IR"/>
         </w:rPr>
+        <w:lastRenderedPageBreak/>
         <w:t>set_fact</w:t>
       </w:r>
       <w:proofErr w:type="spellEnd"/>
@@ -21763,6 +21636,7 @@
           <w:szCs w:val="40"/>
           <w:lang w:bidi="fa-IR"/>
         </w:rPr>
+        <w:lastRenderedPageBreak/>
         <w:t>Magic Variables</w:t>
       </w:r>
       <w:r>
@@ -22555,7 +22429,6 @@
           <w:szCs w:val="28"/>
           <w:lang w:bidi="fa-IR"/>
         </w:rPr>
-        <w:lastRenderedPageBreak/>
         <w:t>group_names</w:t>
       </w:r>
       <w:proofErr w:type="spellEnd"/>
@@ -23264,6 +23137,7 @@
           <w:szCs w:val="28"/>
           <w:lang w:bidi="fa-IR"/>
         </w:rPr>
+        <w:lastRenderedPageBreak/>
         <w:t>Note</w:t>
       </w:r>
       <w:r>

</xml_diff>